<commit_message>
Mniejsze pokoje łączą się ze sobą jeśli ze sobą graniczą
</commit_message>
<xml_diff>
--- a/praca_inżynierska_52753.docx
+++ b/praca_inżynierska_52753.docx
@@ -20,19 +20,20 @@
           <w:sz w:val="22"/>
           <w:szCs w:val="22"/>
         </w:rPr>
-        <w:t xml:space="preserve">Uniwersytet DSW </w:t>
-      </w:r>
-      <w:proofErr w:type="spellStart"/>
-      <w:r>
+        <w:t xml:space="preserve">Uniwersytet DSW Ideis </w:t>
+      </w:r>
+    </w:p>
+    <w:p>
+      <w:pPr>
+        <w:spacing w:line="360" w:lineRule="auto"/>
+        <w:jc w:val="center"/>
         <w:rPr>
           <w:b/>
           <w:bCs/>
           <w:sz w:val="22"/>
           <w:szCs w:val="22"/>
         </w:rPr>
-        <w:t>Ideis</w:t>
-      </w:r>
-      <w:proofErr w:type="spellEnd"/>
+      </w:pPr>
       <w:r>
         <w:rPr>
           <w:b/>
@@ -40,29 +41,29 @@
           <w:sz w:val="22"/>
           <w:szCs w:val="22"/>
         </w:rPr>
-        <w:t xml:space="preserve"> </w:t>
-      </w:r>
-    </w:p>
-    <w:p>
-      <w:pPr>
-        <w:spacing w:line="360" w:lineRule="auto"/>
-        <w:jc w:val="center"/>
+        <w:t xml:space="preserve">Wydział </w:t>
+      </w:r>
+      <w:r>
         <w:rPr>
           <w:b/>
           <w:bCs/>
           <w:sz w:val="22"/>
           <w:szCs w:val="22"/>
         </w:rPr>
-      </w:pPr>
-      <w:r>
+        <w:t>Studiów Stosowanych we Wrocławiu</w:t>
+      </w:r>
+    </w:p>
+    <w:p>
+      <w:pPr>
+        <w:spacing w:line="360" w:lineRule="auto"/>
+        <w:jc w:val="center"/>
         <w:rPr>
           <w:b/>
           <w:bCs/>
           <w:sz w:val="22"/>
           <w:szCs w:val="22"/>
         </w:rPr>
-        <w:t xml:space="preserve">Wydział </w:t>
-      </w:r>
+      </w:pPr>
       <w:r>
         <w:rPr>
           <w:b/>
@@ -70,27 +71,6 @@
           <w:sz w:val="22"/>
           <w:szCs w:val="22"/>
         </w:rPr>
-        <w:t>Studiów Stosowanych we Wrocławiu</w:t>
-      </w:r>
-    </w:p>
-    <w:p>
-      <w:pPr>
-        <w:spacing w:line="360" w:lineRule="auto"/>
-        <w:jc w:val="center"/>
-        <w:rPr>
-          <w:b/>
-          <w:bCs/>
-          <w:sz w:val="22"/>
-          <w:szCs w:val="22"/>
-        </w:rPr>
-      </w:pPr>
-      <w:r>
-        <w:rPr>
-          <w:b/>
-          <w:bCs/>
-          <w:sz w:val="22"/>
-          <w:szCs w:val="22"/>
-        </w:rPr>
         <w:t>studia pierwszego stopnia</w:t>
       </w:r>
     </w:p>
@@ -316,21 +296,7 @@
         <w:rPr>
           <w:color w:val="000000" w:themeColor="text1"/>
         </w:rPr>
-        <w:t>Projekt gry 2D typu top-down </w:t>
-      </w:r>
-      <w:proofErr w:type="spellStart"/>
-      <w:r>
-        <w:rPr>
-          <w:color w:val="000000" w:themeColor="text1"/>
-        </w:rPr>
-        <w:t>shooter</w:t>
-      </w:r>
-      <w:proofErr w:type="spellEnd"/>
-      <w:r>
-        <w:rPr>
-          <w:color w:val="000000" w:themeColor="text1"/>
-        </w:rPr>
-        <w:t> implementujący proceduralność poziomów wraz z systemem aktywności przeciwników w silniku Unity </w:t>
+        <w:t>Projekt gry 2D typu top-down shooter implementujący proceduralność poziomów wraz z systemem aktywności przeciwników w silniku Unity </w:t>
       </w:r>
     </w:p>
     <w:p>
@@ -406,16 +372,8 @@
         <w:rPr>
           <w:color w:val="000000" w:themeColor="text1"/>
         </w:rPr>
-        <w:t xml:space="preserve">mgr inż. Tomasz </w:t>
-      </w:r>
-      <w:proofErr w:type="spellStart"/>
-      <w:r>
-        <w:rPr>
-          <w:color w:val="000000" w:themeColor="text1"/>
-        </w:rPr>
-        <w:t>Sapeta</w:t>
-      </w:r>
-      <w:proofErr w:type="spellEnd"/>
+        <w:t>mgr inż. Tomasz Sapeta</w:t>
+      </w:r>
     </w:p>
     <w:p>
       <w:pPr>
@@ -606,7 +564,7 @@
     <w:p>
       <w:pPr>
         <w:rPr>
-          <w:rStyle w:val="Odwoanieintensywne"/>
+          <w:rStyle w:val="IntenseReference"/>
         </w:rPr>
       </w:pPr>
       <w:r>
@@ -697,7 +655,7 @@
       <w:sdtContent>
         <w:p>
           <w:pPr>
-            <w:pStyle w:val="Nagwekspisutreci"/>
+            <w:pStyle w:val="TOCHeading"/>
           </w:pPr>
           <w:r>
             <w:t>Spis treści</w:t>
@@ -705,7 +663,7 @@
         </w:p>
         <w:p>
           <w:pPr>
-            <w:pStyle w:val="Spistreci1"/>
+            <w:pStyle w:val="TOC1"/>
             <w:tabs>
               <w:tab w:val="right" w:leader="dot" w:pos="9062"/>
             </w:tabs>
@@ -725,7 +683,7 @@
           <w:hyperlink w:anchor="_Toc233987042" w:history="1">
             <w:r>
               <w:rPr>
-                <w:rStyle w:val="Hipercze"/>
+                <w:rStyle w:val="Hyperlink"/>
                 <w:noProof/>
               </w:rPr>
               <w:t>1. Wstęp</w:t>
@@ -782,7 +740,7 @@
         </w:p>
         <w:p>
           <w:pPr>
-            <w:pStyle w:val="Spistreci2"/>
+            <w:pStyle w:val="TOC2"/>
             <w:tabs>
               <w:tab w:val="left" w:pos="960"/>
               <w:tab w:val="right" w:leader="dot" w:pos="9062"/>
@@ -794,7 +752,7 @@
           <w:hyperlink w:anchor="_Toc233987043" w:history="1">
             <w:r>
               <w:rPr>
-                <w:rStyle w:val="Hipercze"/>
+                <w:rStyle w:val="Hyperlink"/>
                 <w:noProof/>
               </w:rPr>
               <w:t>1.1</w:t>
@@ -807,7 +765,7 @@
             </w:r>
             <w:r>
               <w:rPr>
-                <w:rStyle w:val="Hipercze"/>
+                <w:rStyle w:val="Hyperlink"/>
                 <w:noProof/>
                 <w:lang w:val="en-US"/>
               </w:rPr>
@@ -865,7 +823,7 @@
         </w:p>
         <w:p>
           <w:pPr>
-            <w:pStyle w:val="Spistreci3"/>
+            <w:pStyle w:val="TOC3"/>
             <w:tabs>
               <w:tab w:val="left" w:pos="960"/>
               <w:tab w:val="right" w:leader="dot" w:pos="9062"/>
@@ -877,7 +835,7 @@
           <w:hyperlink w:anchor="_Toc233987044" w:history="1">
             <w:r>
               <w:rPr>
-                <w:rStyle w:val="Hipercze"/>
+                <w:rStyle w:val="Hyperlink"/>
                 <w:noProof/>
               </w:rPr>
               <w:t>a.</w:t>
@@ -890,7 +848,7 @@
             </w:r>
             <w:r>
               <w:rPr>
-                <w:rStyle w:val="Hipercze"/>
+                <w:rStyle w:val="Hyperlink"/>
                 <w:noProof/>
               </w:rPr>
               <w:t>Cel główny:</w:t>
@@ -947,7 +905,7 @@
         </w:p>
         <w:p>
           <w:pPr>
-            <w:pStyle w:val="Spistreci3"/>
+            <w:pStyle w:val="TOC3"/>
             <w:tabs>
               <w:tab w:val="left" w:pos="960"/>
               <w:tab w:val="right" w:leader="dot" w:pos="9062"/>
@@ -959,7 +917,7 @@
           <w:hyperlink w:anchor="_Toc233987045" w:history="1">
             <w:r>
               <w:rPr>
-                <w:rStyle w:val="Hipercze"/>
+                <w:rStyle w:val="Hyperlink"/>
                 <w:noProof/>
               </w:rPr>
               <w:t>b.</w:t>
@@ -972,7 +930,7 @@
             </w:r>
             <w:r>
               <w:rPr>
-                <w:rStyle w:val="Hipercze"/>
+                <w:rStyle w:val="Hyperlink"/>
                 <w:noProof/>
               </w:rPr>
               <w:t>Cele szczegółowe:</w:t>
@@ -1029,7 +987,7 @@
         </w:p>
         <w:p>
           <w:pPr>
-            <w:pStyle w:val="Spistreci2"/>
+            <w:pStyle w:val="TOC2"/>
             <w:tabs>
               <w:tab w:val="right" w:leader="dot" w:pos="9062"/>
             </w:tabs>
@@ -1040,7 +998,7 @@
           <w:hyperlink w:anchor="_Toc233987046" w:history="1">
             <w:r>
               <w:rPr>
-                <w:rStyle w:val="Hipercze"/>
+                <w:rStyle w:val="Hyperlink"/>
                 <w:noProof/>
                 <w:lang w:val="en-US"/>
               </w:rPr>
@@ -1098,7 +1056,7 @@
         </w:p>
         <w:p>
           <w:pPr>
-            <w:pStyle w:val="Spistreci1"/>
+            <w:pStyle w:val="TOC1"/>
             <w:tabs>
               <w:tab w:val="right" w:leader="dot" w:pos="9062"/>
             </w:tabs>
@@ -1109,7 +1067,7 @@
           <w:hyperlink w:anchor="_Toc233987047" w:history="1">
             <w:r>
               <w:rPr>
-                <w:rStyle w:val="Hipercze"/>
+                <w:rStyle w:val="Hyperlink"/>
                 <w:noProof/>
               </w:rPr>
               <w:t>2. Podstawowe systemy gry</w:t>
@@ -1166,7 +1124,7 @@
         </w:p>
         <w:p>
           <w:pPr>
-            <w:pStyle w:val="Spistreci2"/>
+            <w:pStyle w:val="TOC2"/>
             <w:tabs>
               <w:tab w:val="right" w:leader="dot" w:pos="9062"/>
             </w:tabs>
@@ -1177,7 +1135,7 @@
           <w:hyperlink w:anchor="_Toc233987048" w:history="1">
             <w:r>
               <w:rPr>
-                <w:rStyle w:val="Hipercze"/>
+                <w:rStyle w:val="Hyperlink"/>
                 <w:noProof/>
               </w:rPr>
               <w:t>2.1 System poruszania się</w:t>
@@ -1234,7 +1192,7 @@
         </w:p>
         <w:p>
           <w:pPr>
-            <w:pStyle w:val="Spistreci2"/>
+            <w:pStyle w:val="TOC2"/>
             <w:tabs>
               <w:tab w:val="right" w:leader="dot" w:pos="9062"/>
             </w:tabs>
@@ -1245,7 +1203,7 @@
           <w:hyperlink w:anchor="_Toc233987049" w:history="1">
             <w:r>
               <w:rPr>
-                <w:rStyle w:val="Hipercze"/>
+                <w:rStyle w:val="Hyperlink"/>
                 <w:noProof/>
               </w:rPr>
               <w:t>2.2 System broni / ekwipunek</w:t>
@@ -1302,7 +1260,7 @@
         </w:p>
         <w:p>
           <w:pPr>
-            <w:pStyle w:val="Spistreci2"/>
+            <w:pStyle w:val="TOC2"/>
             <w:tabs>
               <w:tab w:val="right" w:leader="dot" w:pos="9062"/>
             </w:tabs>
@@ -1313,7 +1271,7 @@
           <w:hyperlink w:anchor="_Toc233987050" w:history="1">
             <w:r>
               <w:rPr>
-                <w:rStyle w:val="Hipercze"/>
+                <w:rStyle w:val="Hyperlink"/>
                 <w:noProof/>
               </w:rPr>
               <w:t>2.3 System walki</w:t>
@@ -1370,7 +1328,7 @@
         </w:p>
         <w:p>
           <w:pPr>
-            <w:pStyle w:val="Spistreci2"/>
+            <w:pStyle w:val="TOC2"/>
             <w:tabs>
               <w:tab w:val="right" w:leader="dot" w:pos="9062"/>
             </w:tabs>
@@ -1381,7 +1339,7 @@
           <w:hyperlink w:anchor="_Toc233987051" w:history="1">
             <w:r>
               <w:rPr>
-                <w:rStyle w:val="Hipercze"/>
+                <w:rStyle w:val="Hyperlink"/>
                 <w:noProof/>
               </w:rPr>
               <w:t>2.4 HUD</w:t>
@@ -1438,7 +1396,7 @@
         </w:p>
         <w:p>
           <w:pPr>
-            <w:pStyle w:val="Spistreci1"/>
+            <w:pStyle w:val="TOC1"/>
             <w:tabs>
               <w:tab w:val="right" w:leader="dot" w:pos="9062"/>
             </w:tabs>
@@ -1449,7 +1407,7 @@
           <w:hyperlink w:anchor="_Toc233987052" w:history="1">
             <w:r>
               <w:rPr>
-                <w:rStyle w:val="Hipercze"/>
+                <w:rStyle w:val="Hyperlink"/>
                 <w:noProof/>
               </w:rPr>
               <w:t>3. Mechanika proceduralności poziomów</w:t>
@@ -1506,7 +1464,7 @@
         </w:p>
         <w:p>
           <w:pPr>
-            <w:pStyle w:val="Spistreci1"/>
+            <w:pStyle w:val="TOC1"/>
             <w:tabs>
               <w:tab w:val="right" w:leader="dot" w:pos="9062"/>
             </w:tabs>
@@ -1517,7 +1475,7 @@
           <w:hyperlink w:anchor="_Toc233987053" w:history="1">
             <w:r>
               <w:rPr>
-                <w:rStyle w:val="Hipercze"/>
+                <w:rStyle w:val="Hyperlink"/>
                 <w:noProof/>
               </w:rPr>
               <w:t>4. AI Przeciwników</w:t>
@@ -1574,7 +1532,7 @@
         </w:p>
         <w:p>
           <w:pPr>
-            <w:pStyle w:val="Spistreci2"/>
+            <w:pStyle w:val="TOC2"/>
             <w:tabs>
               <w:tab w:val="right" w:leader="dot" w:pos="9062"/>
             </w:tabs>
@@ -1585,7 +1543,7 @@
           <w:hyperlink w:anchor="_Toc233987054" w:history="1">
             <w:r>
               <w:rPr>
-                <w:rStyle w:val="Hipercze"/>
+                <w:rStyle w:val="Hyperlink"/>
                 <w:noProof/>
               </w:rPr>
               <w:t>4.1 Podstawa</w:t>
@@ -1642,7 +1600,7 @@
         </w:p>
         <w:p>
           <w:pPr>
-            <w:pStyle w:val="Spistreci1"/>
+            <w:pStyle w:val="TOC1"/>
             <w:tabs>
               <w:tab w:val="right" w:leader="dot" w:pos="9062"/>
             </w:tabs>
@@ -1653,7 +1611,7 @@
           <w:hyperlink w:anchor="_Toc233987055" w:history="1">
             <w:r>
               <w:rPr>
-                <w:rStyle w:val="Hipercze"/>
+                <w:rStyle w:val="Hyperlink"/>
                 <w:noProof/>
               </w:rPr>
               <w:t>5. Podsumowanie</w:t>
@@ -1710,7 +1668,7 @@
         </w:p>
         <w:p>
           <w:pPr>
-            <w:pStyle w:val="Spistreci1"/>
+            <w:pStyle w:val="TOC1"/>
             <w:tabs>
               <w:tab w:val="right" w:leader="dot" w:pos="9062"/>
             </w:tabs>
@@ -1721,7 +1679,7 @@
           <w:hyperlink w:anchor="_Toc233987056" w:history="1">
             <w:r>
               <w:rPr>
-                <w:rStyle w:val="Hipercze"/>
+                <w:rStyle w:val="Hyperlink"/>
                 <w:noProof/>
               </w:rPr>
               <w:t>6. Bibliografia</w:t>
@@ -1799,7 +1757,7 @@
     <w:p>
       <w:pPr>
         <w:rPr>
-          <w:rStyle w:val="Odwoanieintensywne"/>
+          <w:rStyle w:val="IntenseReference"/>
         </w:rPr>
       </w:pPr>
       <w:r>
@@ -2177,7 +2135,7 @@
     </w:p>
     <w:p>
       <w:pPr>
-        <w:pStyle w:val="Nagwek1"/>
+        <w:pStyle w:val="Heading1"/>
       </w:pPr>
       <w:bookmarkStart w:id="0" w:name="_Toc233987042"/>
       <w:r>
@@ -2207,63 +2165,7 @@
         <w:rPr>
           <w:color w:val="000000" w:themeColor="text1"/>
         </w:rPr>
-        <w:t xml:space="preserve">W produkcjach 2D poziomy gry są często stałe i łatwe do zapamiętania, co jest prostą drogą do </w:t>
-      </w:r>
-      <w:proofErr w:type="spellStart"/>
-      <w:r>
-        <w:rPr>
-          <w:color w:val="000000" w:themeColor="text1"/>
-        </w:rPr>
-        <w:t>ekspoatowania</w:t>
-      </w:r>
-      <w:proofErr w:type="spellEnd"/>
-      <w:r>
-        <w:rPr>
-          <w:color w:val="000000" w:themeColor="text1"/>
-        </w:rPr>
-        <w:t xml:space="preserve"> tak zwanych „</w:t>
-      </w:r>
-      <w:proofErr w:type="spellStart"/>
-      <w:r>
-        <w:rPr>
-          <w:color w:val="000000" w:themeColor="text1"/>
-        </w:rPr>
-        <w:t>bugów</w:t>
-      </w:r>
-      <w:proofErr w:type="spellEnd"/>
-      <w:r>
-        <w:rPr>
-          <w:color w:val="000000" w:themeColor="text1"/>
-        </w:rPr>
-        <w:t xml:space="preserve">” przez graczy. Osiągi gracza są </w:t>
-      </w:r>
-      <w:proofErr w:type="spellStart"/>
-      <w:r>
-        <w:rPr>
-          <w:color w:val="000000" w:themeColor="text1"/>
-        </w:rPr>
-        <w:t>zależe</w:t>
-      </w:r>
-      <w:proofErr w:type="spellEnd"/>
-      <w:r>
-        <w:rPr>
-          <w:color w:val="000000" w:themeColor="text1"/>
-        </w:rPr>
-        <w:t xml:space="preserve"> nie od jego umiejętności i znajomości mechanik, a znajomości tych </w:t>
-      </w:r>
-      <w:proofErr w:type="spellStart"/>
-      <w:r>
-        <w:rPr>
-          <w:color w:val="000000" w:themeColor="text1"/>
-        </w:rPr>
-        <w:t>bugów</w:t>
-      </w:r>
-      <w:proofErr w:type="spellEnd"/>
-      <w:r>
-        <w:rPr>
-          <w:color w:val="000000" w:themeColor="text1"/>
-        </w:rPr>
-        <w:t xml:space="preserve"> i umiejętności ich wykorzystywania. Dla przykładu, gracz który jest „sprawiedliwy”, tzn. nie korzysta z błędów, do osiągnięcia najwyższych wyników będzie potrzebował dziesiątek godzin grania. Gracz „oszukujący”  zaś znajdzie błąd pozwalający wejść w ścianę i będzie bezpiecznie eliminować przeciwników z pozycji poza ich zasięgiem. </w:t>
+        <w:t>W produkcjach 2D poziomy gry są często stałe i łatwe do zapamiętania, co jest prostą drogą do ekspoatowania tak zwanych „bugów” przez graczy. Osiągi gracza są zależe nie od jego umiejętności i znajomości mechanik, a znajomości tych bugów i umiejętności ich wykorzystywania. Dla przykładu, gracz który jest „sprawiedliwy”, tzn. nie korzysta z błędów, do osiągnięcia najwyższych wyników będzie potrzebował dziesiątek godzin grania. Gracz „oszukujący”  zaś znajdzie błąd pozwalający wejść w ścianę i będzie bezpiecznie eliminować przeciwników z pozycji poza ich zasięgiem. </w:t>
       </w:r>
       <w:r>
         <w:rPr>
@@ -2296,35 +2198,7 @@
         <w:rPr>
           <w:color w:val="000000" w:themeColor="text1"/>
         </w:rPr>
-        <w:t xml:space="preserve">Przedstawiana gra implementuje AI przeciwników za pomocą stanów oraz </w:t>
-      </w:r>
-      <w:proofErr w:type="spellStart"/>
-      <w:r>
-        <w:rPr>
-          <w:color w:val="000000" w:themeColor="text1"/>
-        </w:rPr>
-        <w:t>Behavior</w:t>
-      </w:r>
-      <w:proofErr w:type="spellEnd"/>
-      <w:r>
-        <w:rPr>
-          <w:color w:val="000000" w:themeColor="text1"/>
-        </w:rPr>
-        <w:t xml:space="preserve"> </w:t>
-      </w:r>
-      <w:proofErr w:type="spellStart"/>
-      <w:r>
-        <w:rPr>
-          <w:color w:val="000000" w:themeColor="text1"/>
-        </w:rPr>
-        <w:t>Graph</w:t>
-      </w:r>
-      <w:proofErr w:type="spellEnd"/>
-      <w:r>
-        <w:rPr>
-          <w:color w:val="000000" w:themeColor="text1"/>
-        </w:rPr>
-        <w:t>, dzięki czemu przeciwnicy będą mogli wykorzystać teren i liczebność do uzyskania przewagi nad graczem.</w:t>
+        <w:t>Przedstawiana gra implementuje AI przeciwników za pomocą stanów oraz Behavior Graph, dzięki czemu przeciwnicy będą mogli wykorzystać teren i liczebność do uzyskania przewagi nad graczem.</w:t>
       </w:r>
     </w:p>
     <w:p>
@@ -2356,7 +2230,7 @@
     </w:p>
     <w:p>
       <w:pPr>
-        <w:pStyle w:val="Nagwek2"/>
+        <w:pStyle w:val="Heading2"/>
         <w:numPr>
           <w:ilvl w:val="1"/>
           <w:numId w:val="25"/>
@@ -2376,7 +2250,7 @@
     </w:p>
     <w:p>
       <w:pPr>
-        <w:pStyle w:val="Nagwek3"/>
+        <w:pStyle w:val="Heading3"/>
         <w:numPr>
           <w:ilvl w:val="0"/>
           <w:numId w:val="24"/>
@@ -2401,35 +2275,7 @@
         <w:rPr>
           <w:color w:val="000000" w:themeColor="text1"/>
         </w:rPr>
-        <w:t xml:space="preserve">Zaprojektowanie i implementacja gry 2D typu top-down </w:t>
-      </w:r>
-      <w:proofErr w:type="spellStart"/>
-      <w:r>
-        <w:rPr>
-          <w:color w:val="000000" w:themeColor="text1"/>
-        </w:rPr>
-        <w:t>shooter</w:t>
-      </w:r>
-      <w:proofErr w:type="spellEnd"/>
-      <w:r>
-        <w:rPr>
-          <w:color w:val="000000" w:themeColor="text1"/>
-        </w:rPr>
-        <w:t xml:space="preserve">, wykorzystując proceduralne generowanie poziomów i przemyślanego systemu </w:t>
-      </w:r>
-      <w:proofErr w:type="spellStart"/>
-      <w:r>
-        <w:rPr>
-          <w:color w:val="000000" w:themeColor="text1"/>
-        </w:rPr>
-        <w:t>zachowań</w:t>
-      </w:r>
-      <w:proofErr w:type="spellEnd"/>
-      <w:r>
-        <w:rPr>
-          <w:color w:val="000000" w:themeColor="text1"/>
-        </w:rPr>
-        <w:t xml:space="preserve"> wrogó</w:t>
+        <w:t>Zaprojektowanie i implementacja gry 2D typu top-down shooter, wykorzystując proceduralne generowanie poziomów i przemyślanego systemu zachowań wrogó</w:t>
       </w:r>
       <w:r>
         <w:rPr>
@@ -2515,7 +2361,7 @@
     </w:p>
     <w:p>
       <w:pPr>
-        <w:pStyle w:val="Nagwek3"/>
+        <w:pStyle w:val="Heading3"/>
         <w:numPr>
           <w:ilvl w:val="0"/>
           <w:numId w:val="24"/>
@@ -2561,35 +2407,7 @@
         <w:rPr>
           <w:color w:val="000000" w:themeColor="text1"/>
         </w:rPr>
-        <w:t xml:space="preserve">Implementacja </w:t>
-      </w:r>
-      <w:proofErr w:type="spellStart"/>
-      <w:r>
-        <w:rPr>
-          <w:color w:val="000000" w:themeColor="text1"/>
-        </w:rPr>
-        <w:t>szczutcznej</w:t>
-      </w:r>
-      <w:proofErr w:type="spellEnd"/>
-      <w:r>
-        <w:rPr>
-          <w:color w:val="000000" w:themeColor="text1"/>
-        </w:rPr>
-        <w:t xml:space="preserve"> inteligencji przeciwników opartego na drzewkach </w:t>
-      </w:r>
-      <w:proofErr w:type="spellStart"/>
-      <w:r>
-        <w:rPr>
-          <w:color w:val="000000" w:themeColor="text1"/>
-        </w:rPr>
-        <w:t>zachowań</w:t>
-      </w:r>
-      <w:proofErr w:type="spellEnd"/>
-      <w:r>
-        <w:rPr>
-          <w:color w:val="000000" w:themeColor="text1"/>
-        </w:rPr>
-        <w:t xml:space="preserve"> oraz stanów </w:t>
+        <w:t>Implementacja szczutcznej inteligencji przeciwników opartego na drzewkach zachowań oraz stanów </w:t>
       </w:r>
     </w:p>
     <w:p>
@@ -2720,21 +2538,7 @@
         <w:rPr>
           <w:color w:val="000000" w:themeColor="text1"/>
         </w:rPr>
-        <w:t xml:space="preserve">Sprawdzenie, jaki wpływ mają zastosowane technologie na </w:t>
-      </w:r>
-      <w:proofErr w:type="spellStart"/>
-      <w:r>
-        <w:rPr>
-          <w:color w:val="000000" w:themeColor="text1"/>
-        </w:rPr>
-        <w:t>grywalność</w:t>
-      </w:r>
-      <w:proofErr w:type="spellEnd"/>
-      <w:r>
-        <w:rPr>
-          <w:color w:val="000000" w:themeColor="text1"/>
-        </w:rPr>
-        <w:t> </w:t>
+        <w:t>Sprawdzenie, jaki wpływ mają zastosowane technologie na grywalność </w:t>
       </w:r>
     </w:p>
     <w:p>
@@ -2747,18 +2551,18 @@
     </w:p>
     <w:p>
       <w:pPr>
-        <w:pStyle w:val="Akapitzlist"/>
+        <w:pStyle w:val="ListParagraph"/>
         <w:numPr>
           <w:ilvl w:val="0"/>
           <w:numId w:val="24"/>
         </w:numPr>
         <w:rPr>
-          <w:rStyle w:val="Nagwek3Znak"/>
-        </w:rPr>
-      </w:pPr>
-      <w:r>
-        <w:rPr>
-          <w:rStyle w:val="Nagwek3Znak"/>
+          <w:rStyle w:val="Heading3Char"/>
+        </w:rPr>
+      </w:pPr>
+      <w:r>
+        <w:rPr>
+          <w:rStyle w:val="Heading3Char"/>
         </w:rPr>
         <w:t>Wykorzystane technologie</w:t>
       </w:r>
@@ -2782,63 +2586,7 @@
         <w:rPr>
           <w:color w:val="000000" w:themeColor="text1"/>
         </w:rPr>
-        <w:t xml:space="preserve">Przedstawiany projekt został utworzony za pomocą silnika Unity, został wybrany ze względu na jego szerokie możliwości w tworzeniu gier 2D. Silnik ten obsługuje skrypty w języku C#. Do utworzenia </w:t>
-      </w:r>
-      <w:proofErr w:type="spellStart"/>
-      <w:r>
-        <w:rPr>
-          <w:color w:val="000000" w:themeColor="text1"/>
-        </w:rPr>
-        <w:t>assetów</w:t>
-      </w:r>
-      <w:proofErr w:type="spellEnd"/>
-      <w:r>
-        <w:rPr>
-          <w:color w:val="000000" w:themeColor="text1"/>
-        </w:rPr>
-        <w:t xml:space="preserve"> został użyty program </w:t>
-      </w:r>
-      <w:proofErr w:type="spellStart"/>
-      <w:r>
-        <w:rPr>
-          <w:color w:val="000000" w:themeColor="text1"/>
-        </w:rPr>
-        <w:t>Asperite</w:t>
-      </w:r>
-      <w:proofErr w:type="spellEnd"/>
-      <w:r>
-        <w:rPr>
-          <w:color w:val="000000" w:themeColor="text1"/>
-        </w:rPr>
-        <w:t xml:space="preserve"> – open </w:t>
-      </w:r>
-      <w:proofErr w:type="spellStart"/>
-      <w:r>
-        <w:rPr>
-          <w:color w:val="000000" w:themeColor="text1"/>
-        </w:rPr>
-        <w:t>source</w:t>
-      </w:r>
-      <w:proofErr w:type="spellEnd"/>
-      <w:r>
-        <w:rPr>
-          <w:color w:val="000000" w:themeColor="text1"/>
-        </w:rPr>
-        <w:t xml:space="preserve"> pozwalający na kreacje obrazów i animacji w stylu </w:t>
-      </w:r>
-      <w:proofErr w:type="spellStart"/>
-      <w:r>
-        <w:rPr>
-          <w:color w:val="000000" w:themeColor="text1"/>
-        </w:rPr>
-        <w:t>pixel</w:t>
-      </w:r>
-      <w:proofErr w:type="spellEnd"/>
-      <w:r>
-        <w:rPr>
-          <w:color w:val="000000" w:themeColor="text1"/>
-        </w:rPr>
-        <w:t xml:space="preserve"> art.</w:t>
+        <w:t>Przedstawiany projekt został utworzony za pomocą silnika Unity, został wybrany ze względu na jego szerokie możliwości w tworzeniu gier 2D. Silnik ten obsługuje skrypty w języku C#. Do utworzenia assetów został użyty program Asperite – open source pozwalający na kreacje obrazów i animacji w stylu pixel art.</w:t>
       </w:r>
     </w:p>
     <w:p>
@@ -2851,7 +2599,7 @@
     </w:p>
     <w:p>
       <w:pPr>
-        <w:pStyle w:val="Nagwek2"/>
+        <w:pStyle w:val="Heading2"/>
       </w:pPr>
       <w:bookmarkStart w:id="4" w:name="_Toc233987046"/>
       <w:r>
@@ -2876,21 +2624,7 @@
         <w:rPr>
           <w:color w:val="000000" w:themeColor="text1"/>
         </w:rPr>
-        <w:t xml:space="preserve">Proceduralne generowanie poziomów oparty o </w:t>
-      </w:r>
-      <w:proofErr w:type="spellStart"/>
-      <w:r>
-        <w:rPr>
-          <w:color w:val="000000" w:themeColor="text1"/>
-        </w:rPr>
-        <w:t>Tilemap</w:t>
-      </w:r>
-      <w:proofErr w:type="spellEnd"/>
-      <w:r>
-        <w:rPr>
-          <w:color w:val="000000" w:themeColor="text1"/>
-        </w:rPr>
-        <w:t> </w:t>
+        <w:t>Proceduralne generowanie poziomów oparty o Tilemap </w:t>
       </w:r>
     </w:p>
     <w:p>
@@ -2907,35 +2641,7 @@
         <w:rPr>
           <w:color w:val="000000" w:themeColor="text1"/>
         </w:rPr>
-        <w:t xml:space="preserve">System przeciwników z </w:t>
-      </w:r>
-      <w:proofErr w:type="spellStart"/>
-      <w:r>
-        <w:rPr>
-          <w:color w:val="000000" w:themeColor="text1"/>
-        </w:rPr>
-        <w:t>inteligentymi</w:t>
-      </w:r>
-      <w:proofErr w:type="spellEnd"/>
-      <w:r>
-        <w:rPr>
-          <w:color w:val="000000" w:themeColor="text1"/>
-        </w:rPr>
-        <w:t xml:space="preserve"> </w:t>
-      </w:r>
-      <w:proofErr w:type="spellStart"/>
-      <w:r>
-        <w:rPr>
-          <w:color w:val="000000" w:themeColor="text1"/>
-        </w:rPr>
-        <w:t>zachowaniami</w:t>
-      </w:r>
-      <w:proofErr w:type="spellEnd"/>
-      <w:r>
-        <w:rPr>
-          <w:color w:val="000000" w:themeColor="text1"/>
-        </w:rPr>
-        <w:t> </w:t>
+        <w:t>System przeciwników z inteligentymi zachowaniami </w:t>
       </w:r>
     </w:p>
     <w:p>
@@ -2952,21 +2658,7 @@
         <w:rPr>
           <w:color w:val="000000" w:themeColor="text1"/>
         </w:rPr>
-        <w:t xml:space="preserve">Podstawowy </w:t>
-      </w:r>
-      <w:proofErr w:type="spellStart"/>
-      <w:r>
-        <w:rPr>
-          <w:color w:val="000000" w:themeColor="text1"/>
-        </w:rPr>
-        <w:t>interface</w:t>
-      </w:r>
-      <w:proofErr w:type="spellEnd"/>
-      <w:r>
-        <w:rPr>
-          <w:color w:val="000000" w:themeColor="text1"/>
-        </w:rPr>
-        <w:t xml:space="preserve"> gracza </w:t>
+        <w:t>Podstawowy interface gracza </w:t>
       </w:r>
     </w:p>
     <w:p>
@@ -3046,21 +2738,7 @@
         <w:rPr>
           <w:color w:val="000000" w:themeColor="text1"/>
         </w:rPr>
-        <w:t xml:space="preserve">Algorytm </w:t>
-      </w:r>
-      <w:proofErr w:type="spellStart"/>
-      <w:r>
-        <w:rPr>
-          <w:color w:val="000000" w:themeColor="text1"/>
-        </w:rPr>
-        <w:t>pathfindingu</w:t>
-      </w:r>
-      <w:proofErr w:type="spellEnd"/>
-      <w:r>
-        <w:rPr>
-          <w:color w:val="000000" w:themeColor="text1"/>
-        </w:rPr>
-        <w:t xml:space="preserve"> *A</w:t>
+        <w:t>Algorytm pathfindingu *A</w:t>
       </w:r>
     </w:p>
     <w:p>
@@ -3111,21 +2789,7 @@
         <w:rPr>
           <w:color w:val="000000" w:themeColor="text1"/>
         </w:rPr>
-        <w:t xml:space="preserve">Gra zostanie wykonana w stylu </w:t>
-      </w:r>
-      <w:proofErr w:type="spellStart"/>
-      <w:r>
-        <w:rPr>
-          <w:color w:val="000000" w:themeColor="text1"/>
-        </w:rPr>
-        <w:t>pixel</w:t>
-      </w:r>
-      <w:proofErr w:type="spellEnd"/>
-      <w:r>
-        <w:rPr>
-          <w:color w:val="000000" w:themeColor="text1"/>
-        </w:rPr>
-        <w:t xml:space="preserve"> art przy użyciu </w:t>
+        <w:t xml:space="preserve">Gra zostanie wykonana w stylu pixel art przy użyciu </w:t>
       </w:r>
       <w:r>
         <w:rPr>
@@ -3137,21 +2801,7 @@
         <w:rPr>
           <w:color w:val="000000" w:themeColor="text1"/>
         </w:rPr>
-        <w:t xml:space="preserve"> </w:t>
-      </w:r>
-      <w:proofErr w:type="spellStart"/>
-      <w:r>
-        <w:rPr>
-          <w:color w:val="000000" w:themeColor="text1"/>
-        </w:rPr>
-        <w:t>asset’ów</w:t>
-      </w:r>
-      <w:proofErr w:type="spellEnd"/>
-      <w:r>
-        <w:rPr>
-          <w:color w:val="000000" w:themeColor="text1"/>
-        </w:rPr>
-        <w:t> </w:t>
+        <w:t xml:space="preserve"> asset’ów </w:t>
       </w:r>
     </w:p>
     <w:p>
@@ -3168,14 +2818,7 @@
         <w:rPr>
           <w:color w:val="000000" w:themeColor="text1"/>
         </w:rPr>
-        <w:t>Brak precyzyjnego balansu gry – doprowadzenie do </w:t>
-      </w:r>
-      <w:proofErr w:type="spellStart"/>
-      <w:r>
-        <w:rPr>
-          <w:color w:val="000000" w:themeColor="text1"/>
-        </w:rPr>
-        <w:t>stn</w:t>
+        <w:t>Brak precyzyjnego balansu gry – doprowadzenie do stn</w:t>
       </w:r>
       <w:r>
         <w:rPr>
@@ -3187,79 +2830,96 @@
         <w:rPr>
           <w:color w:val="000000" w:themeColor="text1"/>
         </w:rPr>
-        <w:t>au</w:t>
-      </w:r>
-      <w:proofErr w:type="spellEnd"/>
+        <w:t>au grywalności jednocześnie dając wyzwanie graczowi </w:t>
+      </w:r>
+    </w:p>
+    <w:p>
+      <w:pPr>
+        <w:rPr>
+          <w:color w:val="000000" w:themeColor="text1"/>
+        </w:rPr>
+      </w:pPr>
       <w:r>
         <w:rPr>
           <w:color w:val="000000" w:themeColor="text1"/>
         </w:rPr>
         <w:t> </w:t>
       </w:r>
-      <w:proofErr w:type="spellStart"/>
-      <w:r>
-        <w:rPr>
-          <w:color w:val="000000" w:themeColor="text1"/>
-        </w:rPr>
-        <w:t>grywalności</w:t>
-      </w:r>
-      <w:proofErr w:type="spellEnd"/>
-      <w:r>
-        <w:rPr>
-          <w:color w:val="000000" w:themeColor="text1"/>
-        </w:rPr>
-        <w:t> jednocześnie dając wyzwanie graczowi </w:t>
-      </w:r>
-    </w:p>
-    <w:p>
-      <w:pPr>
-        <w:rPr>
-          <w:color w:val="000000" w:themeColor="text1"/>
-        </w:rPr>
-      </w:pPr>
-      <w:r>
-        <w:rPr>
-          <w:color w:val="000000" w:themeColor="text1"/>
-        </w:rPr>
+    </w:p>
+    <w:p>
+      <w:pPr>
+        <w:pStyle w:val="Heading1"/>
+      </w:pPr>
+      <w:bookmarkStart w:id="5" w:name="_Toc233987047"/>
+      <w:r>
+        <w:t xml:space="preserve">2. </w:t>
+      </w:r>
+      <w:r>
+        <w:t>Podstawowe systemy gry</w:t>
+      </w:r>
+      <w:bookmarkEnd w:id="5"/>
+      <w:r>
         <w:t> </w:t>
       </w:r>
     </w:p>
     <w:p>
       <w:pPr>
-        <w:pStyle w:val="Nagwek1"/>
-      </w:pPr>
-      <w:bookmarkStart w:id="5" w:name="_Toc233987047"/>
-      <w:r>
-        <w:t xml:space="preserve">2. </w:t>
-      </w:r>
-      <w:r>
-        <w:t>Podstawowe systemy gry</w:t>
-      </w:r>
-      <w:bookmarkEnd w:id="5"/>
+        <w:pStyle w:val="ListParagraph"/>
+        <w:rPr>
+          <w:color w:val="000000" w:themeColor="text1"/>
+        </w:rPr>
+      </w:pPr>
+    </w:p>
+    <w:p>
+      <w:pPr>
+        <w:pStyle w:val="Heading2"/>
+        <w:ind w:left="720"/>
+      </w:pPr>
+      <w:bookmarkStart w:id="6" w:name="_Toc233987048"/>
+      <w:r>
+        <w:t>2.1 System poruszania się</w:t>
+      </w:r>
+      <w:bookmarkEnd w:id="6"/>
       <w:r>
         <w:t> </w:t>
       </w:r>
     </w:p>
     <w:p>
       <w:pPr>
-        <w:pStyle w:val="Akapitzlist"/>
-        <w:rPr>
-          <w:color w:val="000000" w:themeColor="text1"/>
-        </w:rPr>
-      </w:pPr>
-    </w:p>
-    <w:p>
-      <w:pPr>
-        <w:pStyle w:val="Nagwek2"/>
         <w:ind w:left="720"/>
-      </w:pPr>
-      <w:bookmarkStart w:id="6" w:name="_Toc233987048"/>
-      <w:r>
-        <w:t>2.1 System poruszania się</w:t>
-      </w:r>
-      <w:bookmarkEnd w:id="6"/>
-      <w:r>
-        <w:t> </w:t>
+        <w:rPr>
+          <w:color w:val="000000" w:themeColor="text1"/>
+        </w:rPr>
+      </w:pPr>
+      <w:r>
+        <w:rPr>
+          <w:color w:val="000000" w:themeColor="text1"/>
+        </w:rPr>
+        <w:t xml:space="preserve">Gracz jest w stanie poruszać się za pomocą przycisków </w:t>
+      </w:r>
+      <w:r>
+        <w:rPr>
+          <w:color w:val="000000" w:themeColor="text1"/>
+        </w:rPr>
+        <w:t xml:space="preserve">„WSAD” oraz postać skierowana jest w kierunku położenia kursora, dla swobodnego </w:t>
+      </w:r>
+      <w:r>
+        <w:rPr>
+          <w:color w:val="000000" w:themeColor="text1"/>
+        </w:rPr>
+        <w:t>atakowania</w:t>
+      </w:r>
+      <w:r>
+        <w:rPr>
+          <w:color w:val="000000" w:themeColor="text1"/>
+        </w:rPr>
+        <w:t>.</w:t>
+      </w:r>
+      <w:r>
+        <w:rPr>
+          <w:color w:val="000000" w:themeColor="text1"/>
+        </w:rPr>
+        <w:t xml:space="preserve"> Tryb ruchu został wybrany ze względu na popularność wykorzystywania w grach typu shooter.</w:t>
       </w:r>
     </w:p>
     <w:p>
@@ -3269,50 +2929,6 @@
           <w:color w:val="000000" w:themeColor="text1"/>
         </w:rPr>
       </w:pPr>
-      <w:r>
-        <w:rPr>
-          <w:color w:val="000000" w:themeColor="text1"/>
-        </w:rPr>
-        <w:t xml:space="preserve">Gracz jest w stanie poruszać się za pomocą przycisków </w:t>
-      </w:r>
-      <w:r>
-        <w:rPr>
-          <w:color w:val="000000" w:themeColor="text1"/>
-        </w:rPr>
-        <w:t xml:space="preserve">„WSAD” oraz postać skierowana jest w kierunku położenia kursora, dla swobodnego </w:t>
-      </w:r>
-      <w:r>
-        <w:rPr>
-          <w:color w:val="000000" w:themeColor="text1"/>
-        </w:rPr>
-        <w:t>atakowania</w:t>
-      </w:r>
-      <w:r>
-        <w:rPr>
-          <w:color w:val="000000" w:themeColor="text1"/>
-        </w:rPr>
-        <w:t>.</w:t>
-      </w:r>
-      <w:r>
-        <w:rPr>
-          <w:color w:val="000000" w:themeColor="text1"/>
-        </w:rPr>
-        <w:t xml:space="preserve"> Tryb ruchu został wybrany ze względu na popularność wykorzystywania w grach typu </w:t>
-      </w:r>
-      <w:proofErr w:type="spellStart"/>
-      <w:r>
-        <w:rPr>
-          <w:color w:val="000000" w:themeColor="text1"/>
-        </w:rPr>
-        <w:t>shooter</w:t>
-      </w:r>
-      <w:proofErr w:type="spellEnd"/>
-      <w:r>
-        <w:rPr>
-          <w:color w:val="000000" w:themeColor="text1"/>
-        </w:rPr>
-        <w:t>.</w:t>
-      </w:r>
     </w:p>
     <w:p>
       <w:pPr>
@@ -3321,16 +2937,9 @@
           <w:color w:val="000000" w:themeColor="text1"/>
         </w:rPr>
       </w:pPr>
-    </w:p>
-    <w:p>
-      <w:pPr>
-        <w:ind w:left="720"/>
-        <w:rPr>
-          <w:color w:val="000000" w:themeColor="text1"/>
-        </w:rPr>
-      </w:pPr>
-      <w:r>
-        <w:rPr>
+      <w:r>
+        <w:rPr>
+          <w:noProof/>
           <w:color w:val="000000" w:themeColor="text1"/>
         </w:rPr>
         <w:lastRenderedPageBreak/>
@@ -3462,6 +3071,7 @@
       </w:r>
       <w:r>
         <w:rPr>
+          <w:noProof/>
           <w:color w:val="000000" w:themeColor="text1"/>
         </w:rPr>
         <w:drawing>
@@ -3562,35 +3172,7 @@
         <w:rPr>
           <w:color w:val="000000" w:themeColor="text1"/>
         </w:rPr>
-        <w:t xml:space="preserve">W grze został zastosowany pakiet </w:t>
-      </w:r>
-      <w:proofErr w:type="spellStart"/>
-      <w:r>
-        <w:rPr>
-          <w:color w:val="000000" w:themeColor="text1"/>
-        </w:rPr>
-        <w:t>Cinemachine</w:t>
-      </w:r>
-      <w:proofErr w:type="spellEnd"/>
-      <w:r>
-        <w:rPr>
-          <w:color w:val="000000" w:themeColor="text1"/>
-        </w:rPr>
-        <w:t xml:space="preserve"> </w:t>
-      </w:r>
-      <w:proofErr w:type="spellStart"/>
-      <w:r>
-        <w:rPr>
-          <w:color w:val="000000" w:themeColor="text1"/>
-        </w:rPr>
-        <w:t>Camera</w:t>
-      </w:r>
-      <w:proofErr w:type="spellEnd"/>
-      <w:r>
-        <w:rPr>
-          <w:color w:val="000000" w:themeColor="text1"/>
-        </w:rPr>
-        <w:t xml:space="preserve"> dla immersyjnej kamery gracza. Kamera nie jest przytwierdzona do gracza, jednakże zawsze będzie się poruszać w jego kierunku (przesunięcie podczas ruch</w:t>
+        <w:t>W grze został zastosowany pakiet Cinemachine Camera dla immersyjnej kamery gracza. Kamera nie jest przytwierdzona do gracza, jednakże zawsze będzie się poruszać w jego kierunku (przesunięcie podczas ruch</w:t>
       </w:r>
       <w:r>
         <w:rPr>
@@ -3635,7 +3217,7 @@
     </w:p>
     <w:p>
       <w:pPr>
-        <w:pStyle w:val="Akapitzlist"/>
+        <w:pStyle w:val="ListParagraph"/>
         <w:numPr>
           <w:ilvl w:val="0"/>
           <w:numId w:val="33"/>
@@ -3660,7 +3242,7 @@
     </w:p>
     <w:p>
       <w:pPr>
-        <w:pStyle w:val="Akapitzlist"/>
+        <w:pStyle w:val="ListParagraph"/>
         <w:numPr>
           <w:ilvl w:val="0"/>
           <w:numId w:val="33"/>
@@ -3679,7 +3261,7 @@
     </w:p>
     <w:p>
       <w:pPr>
-        <w:pStyle w:val="Akapitzlist"/>
+        <w:pStyle w:val="ListParagraph"/>
         <w:numPr>
           <w:ilvl w:val="0"/>
           <w:numId w:val="33"/>
@@ -3697,7 +3279,7 @@
     </w:p>
     <w:p>
       <w:pPr>
-        <w:pStyle w:val="Akapitzlist"/>
+        <w:pStyle w:val="ListParagraph"/>
         <w:numPr>
           <w:ilvl w:val="0"/>
           <w:numId w:val="33"/>
@@ -3730,7 +3312,7 @@
     </w:p>
     <w:p>
       <w:pPr>
-        <w:pStyle w:val="Nagwek2"/>
+        <w:pStyle w:val="Heading2"/>
         <w:ind w:left="720"/>
       </w:pPr>
       <w:bookmarkStart w:id="7" w:name="_Toc233987049"/>
@@ -3834,7 +3416,7 @@
     </w:p>
     <w:p>
       <w:pPr>
-        <w:pStyle w:val="Akapitzlist"/>
+        <w:pStyle w:val="ListParagraph"/>
         <w:numPr>
           <w:ilvl w:val="0"/>
           <w:numId w:val="27"/>
@@ -3853,7 +3435,7 @@
     </w:p>
     <w:p>
       <w:pPr>
-        <w:pStyle w:val="Akapitzlist"/>
+        <w:pStyle w:val="ListParagraph"/>
         <w:numPr>
           <w:ilvl w:val="0"/>
           <w:numId w:val="27"/>
@@ -3863,25 +3445,17 @@
           <w:color w:val="000000" w:themeColor="text1"/>
         </w:rPr>
       </w:pPr>
-      <w:proofErr w:type="spellStart"/>
       <w:r>
         <w:rPr>
           <w:color w:val="000000" w:themeColor="text1"/>
         </w:rPr>
         <w:lastRenderedPageBreak/>
-        <w:t>Frag</w:t>
-      </w:r>
-      <w:proofErr w:type="spellEnd"/>
-      <w:r>
-        <w:rPr>
-          <w:color w:val="000000" w:themeColor="text1"/>
-        </w:rPr>
-        <w:t xml:space="preserve"> – granat po upływie czasu wybucha zadając obrażenia wszystkim postaciom w zasięgu</w:t>
-      </w:r>
-    </w:p>
-    <w:p>
-      <w:pPr>
-        <w:pStyle w:val="Akapitzlist"/>
+        <w:t>Frag – granat po upływie czasu wybucha zadając obrażenia wszystkim postaciom w zasięgu</w:t>
+      </w:r>
+    </w:p>
+    <w:p>
+      <w:pPr>
+        <w:pStyle w:val="ListParagraph"/>
         <w:numPr>
           <w:ilvl w:val="0"/>
           <w:numId w:val="27"/>
@@ -3891,24 +3465,16 @@
           <w:color w:val="000000" w:themeColor="text1"/>
         </w:rPr>
       </w:pPr>
-      <w:proofErr w:type="spellStart"/>
-      <w:r>
-        <w:rPr>
-          <w:color w:val="000000" w:themeColor="text1"/>
-        </w:rPr>
-        <w:t>Kasket</w:t>
-      </w:r>
-      <w:proofErr w:type="spellEnd"/>
-      <w:r>
-        <w:rPr>
-          <w:color w:val="000000" w:themeColor="text1"/>
-        </w:rPr>
-        <w:t xml:space="preserve"> – po upływie czasu wybucha raniąc wrogów w małej odległości, wypuszczając z siebie kilka mniejszych granatów wybuchających po kontakcie z ziemią</w:t>
-      </w:r>
-    </w:p>
-    <w:p>
-      <w:pPr>
-        <w:pStyle w:val="Akapitzlist"/>
+      <w:r>
+        <w:rPr>
+          <w:color w:val="000000" w:themeColor="text1"/>
+        </w:rPr>
+        <w:t>Kasket – po upływie czasu wybucha raniąc wrogów w małej odległości, wypuszczając z siebie kilka mniejszych granatów wybuchających po kontakcie z ziemią</w:t>
+      </w:r>
+    </w:p>
+    <w:p>
+      <w:pPr>
+        <w:pStyle w:val="ListParagraph"/>
         <w:ind w:left="1080"/>
         <w:rPr>
           <w:color w:val="000000" w:themeColor="text1"/>
@@ -3917,14 +3483,11 @@
     </w:p>
     <w:p>
       <w:pPr>
-        <w:pStyle w:val="Nagwek2"/>
+        <w:pStyle w:val="Heading2"/>
         <w:ind w:firstLine="720"/>
       </w:pPr>
       <w:r>
-        <w:t>2.3</w:t>
-      </w:r>
-      <w:r>
-        <w:t xml:space="preserve"> Punkty gracza</w:t>
+        <w:t>2.3 Punkty gracza</w:t>
       </w:r>
     </w:p>
     <w:p>
@@ -3945,7 +3508,7 @@
     </w:p>
     <w:p>
       <w:pPr>
-        <w:pStyle w:val="Nagwek2"/>
+        <w:pStyle w:val="Heading2"/>
         <w:ind w:left="720"/>
       </w:pPr>
       <w:bookmarkStart w:id="8" w:name="_Toc233987050"/>
@@ -4023,7 +3586,7 @@
     </w:p>
     <w:p>
       <w:pPr>
-        <w:pStyle w:val="Akapitzlist"/>
+        <w:pStyle w:val="ListParagraph"/>
         <w:jc w:val="center"/>
         <w:rPr>
           <w:b/>
@@ -4046,7 +3609,7 @@
     </w:p>
     <w:p>
       <w:pPr>
-        <w:pStyle w:val="Akapitzlist"/>
+        <w:pStyle w:val="ListParagraph"/>
         <w:jc w:val="center"/>
         <w:rPr>
           <w:color w:val="000000" w:themeColor="text1"/>
@@ -4109,7 +3672,7 @@
     </w:p>
     <w:p>
       <w:pPr>
-        <w:pStyle w:val="Akapitzlist"/>
+        <w:pStyle w:val="ListParagraph"/>
         <w:jc w:val="center"/>
         <w:rPr>
           <w:color w:val="000000" w:themeColor="text1"/>
@@ -4180,7 +3743,7 @@
     </w:p>
     <w:p>
       <w:pPr>
-        <w:pStyle w:val="Akapitzlist"/>
+        <w:pStyle w:val="ListParagraph"/>
         <w:jc w:val="center"/>
         <w:rPr>
           <w:color w:val="000000" w:themeColor="text1"/>
@@ -4189,43 +3752,29 @@
     </w:p>
     <w:p>
       <w:pPr>
-        <w:pStyle w:val="Akapitzlist"/>
-        <w:rPr>
-          <w:color w:val="000000" w:themeColor="text1"/>
-        </w:rPr>
-      </w:pPr>
-      <w:r>
-        <w:rPr>
-          <w:color w:val="000000" w:themeColor="text1"/>
-        </w:rPr>
-        <w:t xml:space="preserve">Broń automatyczna średniego zasięgu oraz średnią prędkością </w:t>
-      </w:r>
-      <w:proofErr w:type="spellStart"/>
-      <w:r>
-        <w:rPr>
-          <w:color w:val="000000" w:themeColor="text1"/>
-        </w:rPr>
-        <w:t>strałów</w:t>
-      </w:r>
-      <w:proofErr w:type="spellEnd"/>
-      <w:r>
-        <w:rPr>
-          <w:color w:val="000000" w:themeColor="text1"/>
-        </w:rPr>
-        <w:t xml:space="preserve"> na minutę. Po naciśnięciu przycisku strzału, broń generuje w określonym odstępie czasu pocisk, który porusza się w stronę położenia kursora w momencie strzału,</w:t>
-      </w:r>
-    </w:p>
-    <w:p>
-      <w:pPr>
-        <w:pStyle w:val="Akapitzlist"/>
-        <w:rPr>
-          <w:color w:val="000000" w:themeColor="text1"/>
-        </w:rPr>
-      </w:pPr>
-    </w:p>
-    <w:p>
-      <w:pPr>
-        <w:pStyle w:val="Akapitzlist"/>
+        <w:pStyle w:val="ListParagraph"/>
+        <w:rPr>
+          <w:color w:val="000000" w:themeColor="text1"/>
+        </w:rPr>
+      </w:pPr>
+      <w:r>
+        <w:rPr>
+          <w:color w:val="000000" w:themeColor="text1"/>
+        </w:rPr>
+        <w:t>Broń automatyczna średniego zasięgu oraz średnią prędkością strałów na minutę. Po naciśnięciu przycisku strzału, broń generuje w określonym odstępie czasu pocisk, który porusza się w stronę położenia kursora w momencie strzału,</w:t>
+      </w:r>
+    </w:p>
+    <w:p>
+      <w:pPr>
+        <w:pStyle w:val="ListParagraph"/>
+        <w:rPr>
+          <w:color w:val="000000" w:themeColor="text1"/>
+        </w:rPr>
+      </w:pPr>
+    </w:p>
+    <w:p>
+      <w:pPr>
+        <w:pStyle w:val="ListParagraph"/>
         <w:jc w:val="center"/>
         <w:rPr>
           <w:b/>
@@ -4248,7 +3797,7 @@
     </w:p>
     <w:p>
       <w:pPr>
-        <w:pStyle w:val="Akapitzlist"/>
+        <w:pStyle w:val="ListParagraph"/>
         <w:jc w:val="center"/>
         <w:rPr>
           <w:b/>
@@ -4362,7 +3911,7 @@
     </w:p>
     <w:p>
       <w:pPr>
-        <w:pStyle w:val="Akapitzlist"/>
+        <w:pStyle w:val="ListParagraph"/>
         <w:jc w:val="center"/>
         <w:rPr>
           <w:b/>
@@ -4375,7 +3924,7 @@
     </w:p>
     <w:p>
       <w:pPr>
-        <w:pStyle w:val="Akapitzlist"/>
+        <w:pStyle w:val="ListParagraph"/>
         <w:rPr>
           <w:color w:val="000000" w:themeColor="text1"/>
         </w:rPr>
@@ -4832,21 +4381,7 @@
           <w:color w:val="000000" w:themeColor="text1"/>
         </w:rPr>
         <w:lastRenderedPageBreak/>
-        <w:t xml:space="preserve">Przeciwnik dystansowy władający magią, będący ludzkim układem kostnym. Jego taktyką jest ustawić się w zasięgu ataku gracza ale </w:t>
-      </w:r>
-      <w:proofErr w:type="spellStart"/>
-      <w:r>
-        <w:rPr>
-          <w:color w:val="000000" w:themeColor="text1"/>
-        </w:rPr>
-        <w:t>zdala</w:t>
-      </w:r>
-      <w:proofErr w:type="spellEnd"/>
-      <w:r>
-        <w:rPr>
-          <w:color w:val="000000" w:themeColor="text1"/>
-        </w:rPr>
-        <w:t xml:space="preserve"> od niego, wykorzystując to na swoją przewagę.</w:t>
+        <w:t>Przeciwnik dystansowy władający magią, będący ludzkim układem kostnym. Jego taktyką jest ustawić się w zasięgu ataku gracza ale zdala od niego, wykorzystując to na swoją przewagę.</w:t>
       </w:r>
     </w:p>
     <w:p>
@@ -4859,7 +4394,7 @@
     </w:p>
     <w:p>
       <w:pPr>
-        <w:pStyle w:val="Nagwek2"/>
+        <w:pStyle w:val="Heading2"/>
         <w:ind w:left="720"/>
       </w:pPr>
       <w:bookmarkStart w:id="9" w:name="_Toc233987051"/>
@@ -4904,7 +4439,7 @@
     </w:p>
     <w:p>
       <w:pPr>
-        <w:pStyle w:val="Akapitzlist"/>
+        <w:pStyle w:val="ListParagraph"/>
         <w:numPr>
           <w:ilvl w:val="0"/>
           <w:numId w:val="32"/>
@@ -4922,7 +4457,7 @@
     </w:p>
     <w:p>
       <w:pPr>
-        <w:pStyle w:val="Akapitzlist"/>
+        <w:pStyle w:val="ListParagraph"/>
         <w:numPr>
           <w:ilvl w:val="0"/>
           <w:numId w:val="32"/>
@@ -4940,7 +4475,7 @@
     </w:p>
     <w:p>
       <w:pPr>
-        <w:pStyle w:val="Akapitzlist"/>
+        <w:pStyle w:val="ListParagraph"/>
         <w:numPr>
           <w:ilvl w:val="0"/>
           <w:numId w:val="32"/>
@@ -4958,7 +4493,7 @@
     </w:p>
     <w:p>
       <w:pPr>
-        <w:pStyle w:val="Akapitzlist"/>
+        <w:pStyle w:val="ListParagraph"/>
         <w:numPr>
           <w:ilvl w:val="0"/>
           <w:numId w:val="32"/>
@@ -4976,7 +4511,7 @@
     </w:p>
     <w:p>
       <w:pPr>
-        <w:pStyle w:val="Akapitzlist"/>
+        <w:pStyle w:val="ListParagraph"/>
         <w:numPr>
           <w:ilvl w:val="0"/>
           <w:numId w:val="32"/>
@@ -4994,7 +4529,7 @@
     </w:p>
     <w:p>
       <w:pPr>
-        <w:pStyle w:val="Akapitzlist"/>
+        <w:pStyle w:val="ListParagraph"/>
         <w:numPr>
           <w:ilvl w:val="0"/>
           <w:numId w:val="32"/>
@@ -5012,7 +4547,7 @@
     </w:p>
     <w:p>
       <w:pPr>
-        <w:pStyle w:val="Akapitzlist"/>
+        <w:pStyle w:val="ListParagraph"/>
         <w:rPr>
           <w:color w:val="000000" w:themeColor="text1"/>
         </w:rPr>
@@ -5045,6 +4580,7 @@
       </w:pPr>
       <w:r>
         <w:rPr>
+          <w:noProof/>
           <w:color w:val="000000" w:themeColor="text1"/>
         </w:rPr>
         <w:drawing>
@@ -5155,14 +4691,11 @@
     </w:p>
     <w:p>
       <w:pPr>
-        <w:pStyle w:val="Nagwek2"/>
+        <w:pStyle w:val="Heading2"/>
         <w:ind w:firstLine="720"/>
       </w:pPr>
       <w:r>
-        <w:t>2.6</w:t>
-      </w:r>
-      <w:r>
-        <w:t>. Ulepszenia gracza</w:t>
+        <w:t>2.6. Ulepszenia gracza</w:t>
       </w:r>
     </w:p>
     <w:p>
@@ -5211,7 +4744,6 @@
       <w:r>
         <w:tab/>
       </w:r>
-      <w:proofErr w:type="spellStart"/>
       <w:r>
         <w:rPr>
           <w:b/>
@@ -5219,7 +4751,6 @@
         </w:rPr>
         <w:t>Stamina</w:t>
       </w:r>
-      <w:proofErr w:type="spellEnd"/>
     </w:p>
     <w:p>
       <w:pPr>
@@ -5245,154 +4776,124 @@
         <w:lastRenderedPageBreak/>
         <w:tab/>
       </w:r>
-      <w:proofErr w:type="spellStart"/>
       <w:r>
         <w:rPr>
           <w:b/>
           <w:bCs/>
         </w:rPr>
-        <w:t>Reload</w:t>
-      </w:r>
-      <w:proofErr w:type="spellEnd"/>
-      <w:r>
+        <w:t>Reload boost</w:t>
+      </w:r>
+    </w:p>
+    <w:p>
+      <w:r>
+        <w:tab/>
+        <w:t>Gracz pod wpływem efektu posiada zwiększoną prędkość przeładowywania broni</w:t>
+      </w:r>
+    </w:p>
+    <w:p/>
+    <w:p>
+      <w:pPr>
         <w:rPr>
           <w:b/>
           <w:bCs/>
         </w:rPr>
-        <w:t xml:space="preserve"> </w:t>
-      </w:r>
-      <w:proofErr w:type="spellStart"/>
+      </w:pPr>
+      <w:r>
+        <w:tab/>
+      </w:r>
       <w:r>
         <w:rPr>
           <w:b/>
           <w:bCs/>
         </w:rPr>
-        <w:t>boost</w:t>
-      </w:r>
-      <w:proofErr w:type="spellEnd"/>
-    </w:p>
-    <w:p>
-      <w:r>
-        <w:tab/>
-        <w:t>Gracz pod wpływem efektu posiada zwiększoną prędkość przeładowywania broni</w:t>
+        <w:t>Hot Shot</w:t>
+      </w:r>
+    </w:p>
+    <w:p>
+      <w:pPr>
+        <w:ind w:left="720"/>
+      </w:pPr>
+      <w:r>
+        <w:t>Gracz pod wpływem efektu posiada szansę na wystrzał pocisku który eksploduje po kontakcie z przeciwnikiem, zadając obrażenia w niewielkim obszarze.</w:t>
+      </w:r>
+    </w:p>
+    <w:p>
+      <w:pPr>
+        <w:ind w:left="720"/>
+      </w:pPr>
+    </w:p>
+    <w:p>
+      <w:r>
+        <w:t>Punkty kupna ulepszeń rozlokowane są w pomieszczeniach zablokowanych podczas startu gry. Jednym pomieszczeniu może być maksymalnie jeden punkt ulepszeń, sprzedający jedno ulepszenie. Wraz z ilością posiadanych ulepszeń, cena kupna następnych będzie proporcjonalnie rosnąć.</w:t>
+      </w:r>
+    </w:p>
+    <w:p>
+      <w:pPr>
+        <w:ind w:left="720"/>
+      </w:pPr>
+    </w:p>
+    <w:p>
+      <w:pPr>
+        <w:pStyle w:val="Heading2"/>
+      </w:pPr>
+      <w:r>
+        <w:t>2.7 Ulepszenia broni</w:t>
+      </w:r>
+    </w:p>
+    <w:p>
+      <w:pPr>
+        <w:ind w:firstLine="720"/>
+      </w:pPr>
+      <w:r>
+        <w:t>Gracz może ulepszyć s</w:t>
+      </w:r>
+      <w:r>
+        <w:t>w</w:t>
+      </w:r>
+      <w:r>
+        <w:t>oją broń w trakcie rozgrywki</w:t>
+      </w:r>
+      <w:r>
+        <w:t>, wpierw b</w:t>
+      </w:r>
+      <w:r>
+        <w:t>ędzie on musiał znaleźć na mapie ołtarz, na którym</w:t>
+      </w:r>
+      <w:r>
+        <w:t xml:space="preserve"> dokona ulepszenia</w:t>
+      </w:r>
+      <w:r>
+        <w:t xml:space="preserve"> jeśli posiada </w:t>
+      </w:r>
+      <w:r>
+        <w:t>wystarczającą</w:t>
+      </w:r>
+      <w:r>
+        <w:t xml:space="preserve"> </w:t>
+      </w:r>
+      <w:r>
+        <w:t>ilość</w:t>
+      </w:r>
+      <w:r>
+        <w:t xml:space="preserve"> punktów. Ulepszenia </w:t>
+      </w:r>
+      <w:r>
+        <w:t xml:space="preserve">wzmacniają gracza do następnego zgonu </w:t>
+      </w:r>
+      <w:r>
+        <w:t xml:space="preserve">oraz podnoszą statystyki </w:t>
+      </w:r>
+      <w:r>
+        <w:t>szybkostrzelności</w:t>
+      </w:r>
+      <w:r>
+        <w:t>, obrażeń oraz wielkości magazynka. Każda broń może zostać ulepszona maksymalnie 4 razy.</w:t>
       </w:r>
     </w:p>
     <w:p/>
     <w:p>
       <w:pPr>
-        <w:rPr>
-          <w:b/>
-          <w:bCs/>
-        </w:rPr>
-      </w:pPr>
-      <w:r>
-        <w:tab/>
-      </w:r>
-      <w:r>
-        <w:rPr>
-          <w:b/>
-          <w:bCs/>
-        </w:rPr>
-        <w:t xml:space="preserve">Hot </w:t>
-      </w:r>
-      <w:proofErr w:type="spellStart"/>
-      <w:r>
-        <w:rPr>
-          <w:b/>
-          <w:bCs/>
-        </w:rPr>
-        <w:t>Shot</w:t>
-      </w:r>
-      <w:proofErr w:type="spellEnd"/>
-    </w:p>
-    <w:p>
-      <w:pPr>
-        <w:ind w:left="720"/>
-      </w:pPr>
-      <w:r>
-        <w:t>Gracz pod wpływem efektu posiada szansę na wystrzał pocisku który eksploduje po kontakcie z przeciwnikiem, zadając obrażenia w niewielkim obszarze.</w:t>
-      </w:r>
-    </w:p>
-    <w:p>
-      <w:pPr>
-        <w:ind w:left="720"/>
-      </w:pPr>
-    </w:p>
-    <w:p>
-      <w:r>
-        <w:t>Punkty kupna ulepszeń rozlokowane są w pomieszczeniach zablokowanych podczas startu gry. Jednym pomieszczeniu może być maksymalnie jeden punkt ulepszeń, sprzedający jedno ulepszenie. Wraz z ilością posiadanych ulepszeń, cena kupna następnych będzie proporcjonalnie rosnąć.</w:t>
-      </w:r>
-    </w:p>
-    <w:p>
-      <w:pPr>
-        <w:ind w:left="720"/>
-      </w:pPr>
-    </w:p>
-    <w:p>
-      <w:pPr>
-        <w:pStyle w:val="Nagwek2"/>
-      </w:pPr>
-      <w:r>
-        <w:t>2.</w:t>
-      </w:r>
-      <w:r>
-        <w:t>7 Ulepszenia broni</w:t>
-      </w:r>
-    </w:p>
-    <w:p>
-      <w:pPr>
-        <w:ind w:firstLine="720"/>
-      </w:pPr>
-      <w:r>
-        <w:t>Gracz może ulepszyć s</w:t>
-      </w:r>
-      <w:r>
-        <w:t>w</w:t>
-      </w:r>
-      <w:r>
-        <w:t>oją broń w trakcie rozgrywki</w:t>
-      </w:r>
-      <w:r>
-        <w:t>, wpierw b</w:t>
-      </w:r>
-      <w:r>
-        <w:t>ędzie on musiał znaleźć na mapie ołtarz, na którym</w:t>
-      </w:r>
-      <w:r>
-        <w:t xml:space="preserve"> dokona ulepszenia</w:t>
-      </w:r>
-      <w:r>
-        <w:t xml:space="preserve"> jeśli posiada </w:t>
-      </w:r>
-      <w:r>
-        <w:t>wystarczającą</w:t>
-      </w:r>
-      <w:r>
-        <w:t xml:space="preserve"> </w:t>
-      </w:r>
-      <w:r>
-        <w:t>ilość</w:t>
-      </w:r>
-      <w:r>
-        <w:t xml:space="preserve"> punktów. Ulepszenia </w:t>
-      </w:r>
-      <w:r>
-        <w:t xml:space="preserve">wzmacniają gracza do następnego zgonu </w:t>
-      </w:r>
-      <w:r>
-        <w:t xml:space="preserve">oraz podnoszą statystyki </w:t>
-      </w:r>
-      <w:r>
-        <w:t>szybkostrzelności</w:t>
-      </w:r>
-      <w:r>
-        <w:t>, obrażeń oraz wielkości magazynka. Każda broń może zostać ulepszona maksymalnie 4 razy.</w:t>
-      </w:r>
-    </w:p>
-    <w:p/>
-    <w:p>
-      <w:pPr>
-        <w:pStyle w:val="Nagwek2"/>
+        <w:pStyle w:val="Heading2"/>
       </w:pPr>
       <w:r>
         <w:t xml:space="preserve">2.8 </w:t>
@@ -5419,7 +4920,7 @@
     </w:p>
     <w:p>
       <w:pPr>
-        <w:pStyle w:val="Nagwek1"/>
+        <w:pStyle w:val="Heading1"/>
       </w:pPr>
       <w:bookmarkStart w:id="10" w:name="_Toc233987052"/>
       <w:r>
@@ -5441,21 +4942,8 @@
         <w:ind w:firstLine="720"/>
       </w:pPr>
       <w:r>
-        <w:t>Poziomy generowane są za pomocą algorytmu „</w:t>
-      </w:r>
-      <w:proofErr w:type="spellStart"/>
-      <w:r>
-        <w:t>Binary</w:t>
-      </w:r>
-      <w:proofErr w:type="spellEnd"/>
-      <w:r>
-        <w:t xml:space="preserve"> Space </w:t>
-      </w:r>
-      <w:proofErr w:type="spellStart"/>
-      <w:r>
-        <w:t>Partitioning</w:t>
-      </w:r>
-      <w:proofErr w:type="spellEnd"/>
+        <w:t>Poziomy generowane są za pomocą algorytmu „Binary Space Partitioning</w:t>
+      </w:r>
       <w:r>
         <w:t>”</w:t>
       </w:r>
@@ -5496,7 +4984,7 @@
     </w:p>
     <w:p>
       <w:pPr>
-        <w:pStyle w:val="Nagwek1"/>
+        <w:pStyle w:val="Heading1"/>
       </w:pPr>
       <w:bookmarkStart w:id="11" w:name="_Toc233987053"/>
       <w:r>
@@ -5521,23 +5009,7 @@
         <w:t>zostało za</w:t>
       </w:r>
       <w:r>
-        <w:t xml:space="preserve">programowane za pomocą </w:t>
-      </w:r>
-      <w:proofErr w:type="spellStart"/>
-      <w:r>
-        <w:t>Behavior</w:t>
-      </w:r>
-      <w:proofErr w:type="spellEnd"/>
-      <w:r>
-        <w:t xml:space="preserve"> </w:t>
-      </w:r>
-      <w:proofErr w:type="spellStart"/>
-      <w:r>
-        <w:t>Graph</w:t>
-      </w:r>
-      <w:proofErr w:type="spellEnd"/>
-      <w:r>
-        <w:t xml:space="preserve"> – wbudowanej funkcji Unity do symulowania zachowania przeciwników</w:t>
+        <w:t>programowane za pomocą Behavior Graph – wbudowanej funkcji Unity do symulowania zachowania przeciwników</w:t>
       </w:r>
       <w:r>
         <w:t xml:space="preserve">. </w:t>
@@ -5555,31 +5027,7 @@
         <w:t xml:space="preserve"> Od jednego grafu może odchodzić kilka gałęzi które prowadzą do pojedynczych akcji lub całych sekwencji, a wykonanie następnego zestawu akcji może być zależne od wyniku poprzedniej. </w:t>
       </w:r>
       <w:r>
-        <w:t xml:space="preserve">System ten posiada swój odpowiednik w silniku </w:t>
-      </w:r>
-      <w:proofErr w:type="spellStart"/>
-      <w:r>
-        <w:t>Unreal</w:t>
-      </w:r>
-      <w:proofErr w:type="spellEnd"/>
-      <w:r>
-        <w:t xml:space="preserve"> Engine w postaci funkcji </w:t>
-      </w:r>
-      <w:proofErr w:type="spellStart"/>
-      <w:r>
-        <w:t>Behavior</w:t>
-      </w:r>
-      <w:proofErr w:type="spellEnd"/>
-      <w:r>
-        <w:t xml:space="preserve"> </w:t>
-      </w:r>
-      <w:proofErr w:type="spellStart"/>
-      <w:r>
-        <w:t>Tree</w:t>
-      </w:r>
-      <w:proofErr w:type="spellEnd"/>
-      <w:r>
-        <w:t xml:space="preserve">. </w:t>
+        <w:t xml:space="preserve">System ten posiada swój odpowiednik w silniku Unreal Engine w postaci funkcji Behavior Tree. </w:t>
       </w:r>
       <w:r>
         <w:t xml:space="preserve">Do lepszej kontroli zachowania, </w:t>
@@ -5601,7 +5049,7 @@
     <w:p/>
     <w:p>
       <w:pPr>
-        <w:pStyle w:val="Nagwek2"/>
+        <w:pStyle w:val="Heading2"/>
         <w:ind w:firstLine="720"/>
       </w:pPr>
       <w:r>
@@ -5624,7 +5072,7 @@
     </w:p>
     <w:p>
       <w:pPr>
-        <w:pStyle w:val="Akapitzlist"/>
+        <w:pStyle w:val="ListParagraph"/>
         <w:numPr>
           <w:ilvl w:val="0"/>
           <w:numId w:val="28"/>
@@ -5642,7 +5090,7 @@
     </w:p>
     <w:p>
       <w:pPr>
-        <w:pStyle w:val="Akapitzlist"/>
+        <w:pStyle w:val="ListParagraph"/>
         <w:numPr>
           <w:ilvl w:val="0"/>
           <w:numId w:val="28"/>
@@ -5655,7 +5103,7 @@
     <w:p/>
     <w:p>
       <w:pPr>
-        <w:pStyle w:val="Nagwek2"/>
+        <w:pStyle w:val="Heading2"/>
         <w:ind w:firstLine="720"/>
       </w:pPr>
       <w:r>
@@ -5670,7 +5118,7 @@
     </w:p>
     <w:p>
       <w:pPr>
-        <w:pStyle w:val="Akapitzlist"/>
+        <w:pStyle w:val="ListParagraph"/>
         <w:numPr>
           <w:ilvl w:val="0"/>
           <w:numId w:val="28"/>
@@ -5689,7 +5137,7 @@
     </w:p>
     <w:p>
       <w:pPr>
-        <w:pStyle w:val="Nagwek2"/>
+        <w:pStyle w:val="Heading2"/>
         <w:ind w:firstLine="720"/>
       </w:pPr>
       <w:r>
@@ -5698,7 +5146,7 @@
     </w:p>
     <w:p>
       <w:pPr>
-        <w:pStyle w:val="Akapitzlist"/>
+        <w:pStyle w:val="ListParagraph"/>
         <w:numPr>
           <w:ilvl w:val="0"/>
           <w:numId w:val="28"/>
@@ -5710,7 +5158,7 @@
     </w:p>
     <w:p>
       <w:pPr>
-        <w:pStyle w:val="Akapitzlist"/>
+        <w:pStyle w:val="ListParagraph"/>
         <w:numPr>
           <w:ilvl w:val="0"/>
           <w:numId w:val="28"/>
@@ -5731,7 +5179,7 @@
     </w:p>
     <w:p>
       <w:pPr>
-        <w:pStyle w:val="Akapitzlist"/>
+        <w:pStyle w:val="ListParagraph"/>
       </w:pPr>
     </w:p>
     <w:p>
@@ -5746,15 +5194,7 @@
         </w:rPr>
       </w:pPr>
       <w:r>
-        <w:t xml:space="preserve">Do poruszania się, przeciwnicy wykorzystują algorytm </w:t>
-      </w:r>
-      <w:proofErr w:type="spellStart"/>
-      <w:r>
-        <w:t>pathfindingu</w:t>
-      </w:r>
-      <w:proofErr w:type="spellEnd"/>
-      <w:r>
-        <w:t xml:space="preserve"> *A który znajduje najkrótszą drogę do gracza oraz pozwoli na ominięcie ścian i przeszkód.</w:t>
+        <w:t>Do poruszania się, przeciwnicy wykorzystują algorytm pathfindingu *A który znajduje najkrótszą drogę do gracza oraz pozwoli na ominięcie ścian i przeszkód.</w:t>
       </w:r>
       <w:r>
         <w:t xml:space="preserve"> Algorytm posiada model pamięciowy, pozwalający na dotarcie do każdego przeznaczonego do chodzenia miejsca na mapie.</w:t>
@@ -5765,7 +5205,7 @@
     </w:p>
     <w:p>
       <w:pPr>
-        <w:pStyle w:val="Nagwek1"/>
+        <w:pStyle w:val="Heading1"/>
       </w:pPr>
       <w:bookmarkStart w:id="12" w:name="_Toc233987055"/>
       <w:r>
@@ -5813,7 +5253,7 @@
     </w:p>
     <w:p>
       <w:pPr>
-        <w:pStyle w:val="Nagwek1"/>
+        <w:pStyle w:val="Heading1"/>
       </w:pPr>
       <w:bookmarkStart w:id="13" w:name="_Toc233987056"/>
       <w:r>
@@ -5832,7 +5272,7 @@
     </w:p>
     <w:p>
       <w:pPr>
-        <w:pStyle w:val="Akapitzlist"/>
+        <w:pStyle w:val="ListParagraph"/>
         <w:numPr>
           <w:ilvl w:val="0"/>
           <w:numId w:val="35"/>
@@ -5850,7 +5290,7 @@
       <w:hyperlink r:id="rId18" w:history="1">
         <w:r>
           <w:rPr>
-            <w:rStyle w:val="Hipercze"/>
+            <w:rStyle w:val="Hyperlink"/>
           </w:rPr>
           <w:t>https://elektron.elka.pw.edu.pl/~jarabas/ALHE/notatki3.pdf</w:t>
         </w:r>
@@ -5858,7 +5298,7 @@
     </w:p>
     <w:p>
       <w:pPr>
-        <w:pStyle w:val="Akapitzlist"/>
+        <w:pStyle w:val="ListParagraph"/>
         <w:numPr>
           <w:ilvl w:val="0"/>
           <w:numId w:val="35"/>
@@ -5872,18 +5312,12 @@
         <w:rPr>
           <w:lang w:val="en-US"/>
         </w:rPr>
-        <w:t>Binary Space Partitioning</w:t>
-      </w:r>
-      <w:r>
-        <w:rPr>
-          <w:lang w:val="en-US"/>
-        </w:rPr>
-        <w:t xml:space="preserve"> - </w:t>
+        <w:t xml:space="preserve">Binary Space Partitioning - </w:t>
       </w:r>
       <w:hyperlink r:id="rId19" w:history="1">
         <w:r>
           <w:rPr>
-            <w:rStyle w:val="Hipercze"/>
+            <w:rStyle w:val="Hyperlink"/>
             <w:lang w:val="en-US"/>
           </w:rPr>
           <w:t>https://ansyshelp.ansys.com/public/account/secured?returnurl=/Views/Secured/corp/v252/en/sysc_th/sysc_th_bsp_algo.html</w:t>
@@ -5892,123 +5326,88 @@
     </w:p>
     <w:p>
       <w:pPr>
+        <w:pStyle w:val="ListParagraph"/>
+        <w:numPr>
+          <w:ilvl w:val="0"/>
+          <w:numId w:val="35"/>
+        </w:numPr>
         <w:rPr>
           <w:color w:val="000000" w:themeColor="text1"/>
           <w:lang w:val="en-US"/>
         </w:rPr>
       </w:pPr>
-    </w:p>
-    <w:p>
-      <w:pPr>
-        <w:pStyle w:val="Nagwek1"/>
-      </w:pPr>
-      <w:r>
-        <w:t xml:space="preserve">9. </w:t>
-      </w:r>
-      <w:r>
-        <w:t>Pakiety i inne źródła</w:t>
-      </w:r>
-    </w:p>
-    <w:p>
-      <w:pPr>
+      <w:r>
         <w:rPr>
           <w:lang w:val="en-US"/>
         </w:rPr>
-      </w:pPr>
-      <w:proofErr w:type="spellStart"/>
-      <w:r>
-        <w:rPr>
+        <w:t>Unity C# Dictionary -</w:t>
+      </w:r>
+      <w:r>
+        <w:rPr>
+          <w:color w:val="000000" w:themeColor="text1"/>
           <w:lang w:val="en-US"/>
         </w:rPr>
-        <w:t>Cinemachine</w:t>
-      </w:r>
-      <w:proofErr w:type="spellEnd"/>
-      <w:r>
-        <w:rPr>
-          <w:lang w:val="en-US"/>
-        </w:rPr>
-        <w:t xml:space="preserve"> Camera - </w:t>
+        <w:t xml:space="preserve"> </w:t>
       </w:r>
       <w:hyperlink r:id="rId20" w:history="1">
         <w:r>
           <w:rPr>
-            <w:rStyle w:val="Hipercze"/>
+            <w:rStyle w:val="Hyperlink"/>
             <w:lang w:val="en-US"/>
+          </w:rPr>
+          <w:t>https://learn.microsoft.com/en-us/dotnet/api/system.collections.generic.dictionary-2?view=net-6.0</w:t>
+        </w:r>
+      </w:hyperlink>
+    </w:p>
+    <w:p>
+      <w:pPr>
+        <w:rPr>
+          <w:color w:val="000000" w:themeColor="text1"/>
+          <w:lang w:val="en-US"/>
+        </w:rPr>
+      </w:pPr>
+    </w:p>
+    <w:p>
+      <w:pPr>
+        <w:pStyle w:val="Heading1"/>
+      </w:pPr>
+      <w:r>
+        <w:lastRenderedPageBreak/>
+        <w:t xml:space="preserve">9. </w:t>
+      </w:r>
+      <w:r>
+        <w:t>Pakiety i inne źródła</w:t>
+      </w:r>
+    </w:p>
+    <w:p>
+      <w:r>
+        <w:t xml:space="preserve">Cinemachine Camera - </w:t>
+      </w:r>
+      <w:hyperlink r:id="rId21" w:history="1">
+        <w:r>
+          <w:rPr>
+            <w:rStyle w:val="Hyperlink"/>
           </w:rPr>
           <w:t>https://docs.unity3d.com/Packages/com.unity.cinemachine@6.6/manual/index.html</w:t>
         </w:r>
       </w:hyperlink>
     </w:p>
-    <w:p>
-      <w:pPr>
-        <w:rPr>
-          <w:lang w:val="en-US"/>
-        </w:rPr>
-      </w:pPr>
-    </w:p>
-    <w:p>
-      <w:pPr>
-        <w:rPr>
-          <w:lang w:val="en-US"/>
-        </w:rPr>
-      </w:pPr>
-    </w:p>
-    <w:p>
-      <w:pPr>
-        <w:rPr>
-          <w:lang w:val="en-US"/>
-        </w:rPr>
-      </w:pPr>
-    </w:p>
-    <w:p>
-      <w:pPr>
-        <w:rPr>
-          <w:lang w:val="en-US"/>
-        </w:rPr>
-      </w:pPr>
-    </w:p>
-    <w:p>
-      <w:pPr>
-        <w:rPr>
-          <w:lang w:val="en-US"/>
-        </w:rPr>
-      </w:pPr>
-    </w:p>
-    <w:p>
-      <w:pPr>
-        <w:rPr>
-          <w:lang w:val="en-US"/>
-        </w:rPr>
-      </w:pPr>
-    </w:p>
-    <w:p>
-      <w:pPr>
-        <w:rPr>
-          <w:lang w:val="en-US"/>
-        </w:rPr>
-      </w:pPr>
-    </w:p>
-    <w:p>
-      <w:pPr>
-        <w:rPr>
-          <w:lang w:val="en-US"/>
-        </w:rPr>
-      </w:pPr>
-    </w:p>
-    <w:p>
-      <w:pPr>
-        <w:rPr>
-          <w:lang w:val="en-US"/>
-        </w:rPr>
-      </w:pPr>
-    </w:p>
+    <w:p/>
+    <w:p/>
+    <w:p/>
+    <w:p/>
+    <w:p/>
+    <w:p/>
+    <w:p/>
+    <w:p/>
+    <w:p/>
     <w:sectPr>
-      <w:headerReference w:type="even" r:id="rId21"/>
-      <w:headerReference w:type="default" r:id="rId22"/>
-      <w:footerReference w:type="even" r:id="rId23"/>
-      <w:footerReference w:type="default" r:id="rId24"/>
-      <w:headerReference w:type="first" r:id="rId25"/>
-      <w:footerReference w:type="first" r:id="rId26"/>
+      <w:headerReference w:type="even" r:id="rId22"/>
+      <w:headerReference w:type="default" r:id="rId23"/>
+      <w:footerReference w:type="even" r:id="rId24"/>
+      <w:footerReference w:type="default" r:id="rId25"/>
+      <w:headerReference w:type="first" r:id="rId26"/>
+      <w:footerReference w:type="first" r:id="rId27"/>
       <w:pgSz w:w="11906" w:h="16838" w:code="9"/>
       <w:pgMar w:top="1417" w:right="1417" w:bottom="1417" w:left="1417" w:header="567" w:footer="567" w:gutter="0"/>
       <w:cols w:space="708"/>
@@ -6042,7 +5441,7 @@
 <w:ftr xmlns:wpc="http://schemas.microsoft.com/office/word/2010/wordprocessingCanvas" xmlns:cx="http://schemas.microsoft.com/office/drawing/2014/chartex" xmlns:cx1="http://schemas.microsoft.com/office/drawing/2015/9/8/chartex" xmlns:cx2="http://schemas.microsoft.com/office/drawing/2015/10/21/chartex" xmlns:cx3="http://schemas.microsoft.com/office/drawing/2016/5/9/chartex" xmlns:cx4="http://schemas.microsoft.com/office/drawing/2016/5/10/chartex" xmlns:cx5="http://schemas.microsoft.com/office/drawing/2016/5/11/chartex" xmlns:cx6="http://schemas.microsoft.com/office/drawing/2016/5/12/chartex" xmlns:cx7="http://schemas.microsoft.com/office/drawing/2016/5/13/chartex" xmlns:cx8="http://schemas.microsoft.com/office/drawing/2016/5/14/chartex" xmlns:mc="http://schemas.openxmlformats.org/markup-compatibility/2006" xmlns:aink="http://schemas.microsoft.com/office/drawing/2016/ink" xmlns:am3d="http://schemas.microsoft.com/office/drawing/2017/model3d" xmlns:o="urn:schemas-microsoft-com:office:office" xmlns:oel="http://schemas.microsoft.com/office/2019/extlst" xmlns:r="http://schemas.openxmlformats.org/officeDocument/2006/relationships" xmlns:m="http://schemas.openxmlformats.org/officeDocument/2006/math" xmlns:v="urn:schemas-microsoft-com:vml" xmlns:wp14="http://schemas.microsoft.com/office/word/2010/wordprocessingDrawing" xmlns:wp="http://schemas.openxmlformats.org/drawingml/2006/wordprocessingDrawing" xmlns:w10="urn:schemas-microsoft-com:office:word" xmlns:w="http://schemas.openxmlformats.org/wordprocessingml/2006/main" xmlns:w14="http://schemas.microsoft.com/office/word/2010/wordml" xmlns:w15="http://schemas.microsoft.com/office/word/2012/wordml" xmlns:w16cex="http://schemas.microsoft.com/office/word/2018/wordml/cex" xmlns:w16cid="http://schemas.microsoft.com/office/word/2016/wordml/cid" xmlns:w16="http://schemas.microsoft.com/office/word/2018/wordml" xmlns:w16du="http://schemas.microsoft.com/office/word/2023/wordml/word16du" xmlns:w16sdtdh="http://schemas.microsoft.com/office/word/2020/wordml/sdtdatahash" xmlns:w16sdtfl="http://schemas.microsoft.com/office/word/2024/wordml/sdtformatlock" xmlns:w16se="http://schemas.microsoft.com/office/word/2015/wordml/symex" xmlns:wpg="http://schemas.microsoft.com/office/word/2010/wordprocessingGroup" xmlns:wpi="http://schemas.microsoft.com/office/word/2010/wordprocessingInk" xmlns:wne="http://schemas.microsoft.com/office/word/2006/wordml" xmlns:wps="http://schemas.microsoft.com/office/word/2010/wordprocessingShape" mc:Ignorable="w14 w15 w16se w16cid w16 w16cex w16sdtdh w16sdtfl w16du wp14">
   <w:p>
     <w:pPr>
-      <w:pStyle w:val="Stopka"/>
+      <w:pStyle w:val="Footer"/>
     </w:pPr>
   </w:p>
 </w:ftr>
@@ -6052,11 +5451,11 @@
 <w:ftr xmlns:wpc="http://schemas.microsoft.com/office/word/2010/wordprocessingCanvas" xmlns:cx="http://schemas.microsoft.com/office/drawing/2014/chartex" xmlns:cx1="http://schemas.microsoft.com/office/drawing/2015/9/8/chartex" xmlns:cx2="http://schemas.microsoft.com/office/drawing/2015/10/21/chartex" xmlns:cx3="http://schemas.microsoft.com/office/drawing/2016/5/9/chartex" xmlns:cx4="http://schemas.microsoft.com/office/drawing/2016/5/10/chartex" xmlns:cx5="http://schemas.microsoft.com/office/drawing/2016/5/11/chartex" xmlns:cx6="http://schemas.microsoft.com/office/drawing/2016/5/12/chartex" xmlns:cx7="http://schemas.microsoft.com/office/drawing/2016/5/13/chartex" xmlns:cx8="http://schemas.microsoft.com/office/drawing/2016/5/14/chartex" xmlns:mc="http://schemas.openxmlformats.org/markup-compatibility/2006" xmlns:aink="http://schemas.microsoft.com/office/drawing/2016/ink" xmlns:am3d="http://schemas.microsoft.com/office/drawing/2017/model3d" xmlns:o="urn:schemas-microsoft-com:office:office" xmlns:oel="http://schemas.microsoft.com/office/2019/extlst" xmlns:r="http://schemas.openxmlformats.org/officeDocument/2006/relationships" xmlns:m="http://schemas.openxmlformats.org/officeDocument/2006/math" xmlns:v="urn:schemas-microsoft-com:vml" xmlns:wp14="http://schemas.microsoft.com/office/word/2010/wordprocessingDrawing" xmlns:wp="http://schemas.openxmlformats.org/drawingml/2006/wordprocessingDrawing" xmlns:w10="urn:schemas-microsoft-com:office:word" xmlns:w="http://schemas.openxmlformats.org/wordprocessingml/2006/main" xmlns:w14="http://schemas.microsoft.com/office/word/2010/wordml" xmlns:w15="http://schemas.microsoft.com/office/word/2012/wordml" xmlns:w16cex="http://schemas.microsoft.com/office/word/2018/wordml/cex" xmlns:w16cid="http://schemas.microsoft.com/office/word/2016/wordml/cid" xmlns:w16="http://schemas.microsoft.com/office/word/2018/wordml" xmlns:w16du="http://schemas.microsoft.com/office/word/2023/wordml/word16du" xmlns:w16sdtdh="http://schemas.microsoft.com/office/word/2020/wordml/sdtdatahash" xmlns:w16sdtfl="http://schemas.microsoft.com/office/word/2024/wordml/sdtformatlock" xmlns:w16se="http://schemas.microsoft.com/office/word/2015/wordml/symex" xmlns:wpg="http://schemas.microsoft.com/office/word/2010/wordprocessingGroup" xmlns:wpi="http://schemas.microsoft.com/office/word/2010/wordprocessingInk" xmlns:wne="http://schemas.microsoft.com/office/word/2006/wordml" xmlns:wps="http://schemas.microsoft.com/office/word/2010/wordprocessingShape" mc:Ignorable="w14 w15 w16se w16cid w16 w16cex w16sdtdh w16sdtfl w16du wp14">
   <w:p>
     <w:pPr>
-      <w:pStyle w:val="Stopka"/>
+      <w:pStyle w:val="Footer"/>
       <w:framePr w:w="989" w:wrap="around" w:vAnchor="text" w:hAnchor="page" w:x="5221" w:y="59"/>
       <w:jc w:val="center"/>
       <w:rPr>
-        <w:rStyle w:val="Numerstrony"/>
+        <w:rStyle w:val="PageNumber"/>
         <w:rFonts w:ascii="Century Gothic" w:hAnsi="Century Gothic"/>
         <w:b/>
         <w:sz w:val="16"/>
@@ -6065,7 +5464,7 @@
     </w:pPr>
     <w:r>
       <w:rPr>
-        <w:rStyle w:val="Numerstrony"/>
+        <w:rStyle w:val="PageNumber"/>
         <w:rFonts w:ascii="Century Gothic" w:hAnsi="Century Gothic"/>
         <w:b/>
         <w:sz w:val="16"/>
@@ -6075,7 +5474,7 @@
     </w:r>
     <w:r>
       <w:rPr>
-        <w:rStyle w:val="Numerstrony"/>
+        <w:rStyle w:val="PageNumber"/>
         <w:rFonts w:ascii="Century Gothic" w:hAnsi="Century Gothic"/>
         <w:b/>
         <w:sz w:val="16"/>
@@ -6085,7 +5484,7 @@
     </w:r>
     <w:r>
       <w:rPr>
-        <w:rStyle w:val="Numerstrony"/>
+        <w:rStyle w:val="PageNumber"/>
         <w:rFonts w:ascii="Century Gothic" w:hAnsi="Century Gothic"/>
         <w:b/>
         <w:sz w:val="16"/>
@@ -6095,7 +5494,7 @@
     </w:r>
     <w:r>
       <w:rPr>
-        <w:rStyle w:val="Numerstrony"/>
+        <w:rStyle w:val="PageNumber"/>
         <w:rFonts w:ascii="Century Gothic" w:hAnsi="Century Gothic"/>
         <w:b/>
         <w:sz w:val="16"/>
@@ -6105,7 +5504,7 @@
     </w:r>
     <w:r>
       <w:rPr>
-        <w:rStyle w:val="Numerstrony"/>
+        <w:rStyle w:val="PageNumber"/>
         <w:rFonts w:ascii="Century Gothic" w:hAnsi="Century Gothic"/>
         <w:b/>
         <w:noProof/>
@@ -6116,7 +5515,7 @@
     </w:r>
     <w:r>
       <w:rPr>
-        <w:rStyle w:val="Numerstrony"/>
+        <w:rStyle w:val="PageNumber"/>
         <w:rFonts w:ascii="Century Gothic" w:hAnsi="Century Gothic"/>
         <w:b/>
         <w:sz w:val="16"/>
@@ -6126,7 +5525,7 @@
     </w:r>
     <w:r>
       <w:rPr>
-        <w:rStyle w:val="Numerstrony"/>
+        <w:rStyle w:val="PageNumber"/>
         <w:rFonts w:ascii="Century Gothic" w:hAnsi="Century Gothic"/>
         <w:b/>
         <w:sz w:val="16"/>
@@ -6136,7 +5535,7 @@
     </w:r>
     <w:r>
       <w:rPr>
-        <w:rStyle w:val="Numerstrony"/>
+        <w:rStyle w:val="PageNumber"/>
         <w:rFonts w:ascii="Century Gothic" w:hAnsi="Century Gothic"/>
         <w:b/>
         <w:sz w:val="16"/>
@@ -6146,7 +5545,7 @@
     </w:r>
     <w:r>
       <w:rPr>
-        <w:rStyle w:val="Numerstrony"/>
+        <w:rStyle w:val="PageNumber"/>
         <w:rFonts w:ascii="Century Gothic" w:hAnsi="Century Gothic"/>
         <w:b/>
         <w:sz w:val="16"/>
@@ -6156,7 +5555,7 @@
     </w:r>
     <w:r>
       <w:rPr>
-        <w:rStyle w:val="Numerstrony"/>
+        <w:rStyle w:val="PageNumber"/>
         <w:rFonts w:ascii="Century Gothic" w:hAnsi="Century Gothic"/>
         <w:b/>
         <w:sz w:val="16"/>
@@ -6166,7 +5565,7 @@
     </w:r>
     <w:r>
       <w:rPr>
-        <w:rStyle w:val="Numerstrony"/>
+        <w:rStyle w:val="PageNumber"/>
         <w:rFonts w:ascii="Century Gothic" w:hAnsi="Century Gothic"/>
         <w:b/>
         <w:noProof/>
@@ -6177,7 +5576,7 @@
     </w:r>
     <w:r>
       <w:rPr>
-        <w:rStyle w:val="Numerstrony"/>
+        <w:rStyle w:val="PageNumber"/>
         <w:rFonts w:ascii="Century Gothic" w:hAnsi="Century Gothic"/>
         <w:b/>
         <w:sz w:val="16"/>
@@ -6188,7 +5587,7 @@
   </w:p>
   <w:p>
     <w:pPr>
-      <w:pStyle w:val="Stopka"/>
+      <w:pStyle w:val="Footer"/>
     </w:pPr>
   </w:p>
 </w:ftr>
@@ -6198,27 +5597,27 @@
 <w:ftr xmlns:wpc="http://schemas.microsoft.com/office/word/2010/wordprocessingCanvas" xmlns:cx="http://schemas.microsoft.com/office/drawing/2014/chartex" xmlns:cx1="http://schemas.microsoft.com/office/drawing/2015/9/8/chartex" xmlns:cx2="http://schemas.microsoft.com/office/drawing/2015/10/21/chartex" xmlns:cx3="http://schemas.microsoft.com/office/drawing/2016/5/9/chartex" xmlns:cx4="http://schemas.microsoft.com/office/drawing/2016/5/10/chartex" xmlns:cx5="http://schemas.microsoft.com/office/drawing/2016/5/11/chartex" xmlns:cx6="http://schemas.microsoft.com/office/drawing/2016/5/12/chartex" xmlns:cx7="http://schemas.microsoft.com/office/drawing/2016/5/13/chartex" xmlns:cx8="http://schemas.microsoft.com/office/drawing/2016/5/14/chartex" xmlns:mc="http://schemas.openxmlformats.org/markup-compatibility/2006" xmlns:aink="http://schemas.microsoft.com/office/drawing/2016/ink" xmlns:am3d="http://schemas.microsoft.com/office/drawing/2017/model3d" xmlns:o="urn:schemas-microsoft-com:office:office" xmlns:oel="http://schemas.microsoft.com/office/2019/extlst" xmlns:r="http://schemas.openxmlformats.org/officeDocument/2006/relationships" xmlns:m="http://schemas.openxmlformats.org/officeDocument/2006/math" xmlns:v="urn:schemas-microsoft-com:vml" xmlns:wp14="http://schemas.microsoft.com/office/word/2010/wordprocessingDrawing" xmlns:wp="http://schemas.openxmlformats.org/drawingml/2006/wordprocessingDrawing" xmlns:w10="urn:schemas-microsoft-com:office:word" xmlns:w="http://schemas.openxmlformats.org/wordprocessingml/2006/main" xmlns:w14="http://schemas.microsoft.com/office/word/2010/wordml" xmlns:w15="http://schemas.microsoft.com/office/word/2012/wordml" xmlns:w16cex="http://schemas.microsoft.com/office/word/2018/wordml/cex" xmlns:w16cid="http://schemas.microsoft.com/office/word/2016/wordml/cid" xmlns:w16="http://schemas.microsoft.com/office/word/2018/wordml" xmlns:w16du="http://schemas.microsoft.com/office/word/2023/wordml/word16du" xmlns:w16sdtdh="http://schemas.microsoft.com/office/word/2020/wordml/sdtdatahash" xmlns:w16sdtfl="http://schemas.microsoft.com/office/word/2024/wordml/sdtformatlock" xmlns:w16se="http://schemas.microsoft.com/office/word/2015/wordml/symex" xmlns:wpg="http://schemas.microsoft.com/office/word/2010/wordprocessingGroup" xmlns:wpi="http://schemas.microsoft.com/office/word/2010/wordprocessingInk" xmlns:wne="http://schemas.microsoft.com/office/word/2006/wordml" xmlns:wps="http://schemas.microsoft.com/office/word/2010/wordprocessingShape" mc:Ignorable="w14 w15 w16se w16cid w16 w16cex w16sdtdh w16sdtfl w16du wp14">
   <w:p>
     <w:pPr>
-      <w:pStyle w:val="Stopka"/>
+      <w:pStyle w:val="Footer"/>
     </w:pPr>
   </w:p>
   <w:p>
     <w:pPr>
-      <w:pStyle w:val="Stopka"/>
+      <w:pStyle w:val="Footer"/>
     </w:pPr>
   </w:p>
   <w:p>
     <w:pPr>
-      <w:pStyle w:val="Stopka"/>
+      <w:pStyle w:val="Footer"/>
     </w:pPr>
   </w:p>
   <w:p>
     <w:pPr>
-      <w:pStyle w:val="Stopka"/>
+      <w:pStyle w:val="Footer"/>
     </w:pPr>
   </w:p>
   <w:p>
     <w:pPr>
-      <w:pStyle w:val="Stopka"/>
+      <w:pStyle w:val="Footer"/>
     </w:pPr>
   </w:p>
 </w:ftr>
@@ -6247,7 +5646,7 @@
 <w:hdr xmlns:wpc="http://schemas.microsoft.com/office/word/2010/wordprocessingCanvas" xmlns:cx="http://schemas.microsoft.com/office/drawing/2014/chartex" xmlns:cx1="http://schemas.microsoft.com/office/drawing/2015/9/8/chartex" xmlns:cx2="http://schemas.microsoft.com/office/drawing/2015/10/21/chartex" xmlns:cx3="http://schemas.microsoft.com/office/drawing/2016/5/9/chartex" xmlns:cx4="http://schemas.microsoft.com/office/drawing/2016/5/10/chartex" xmlns:cx5="http://schemas.microsoft.com/office/drawing/2016/5/11/chartex" xmlns:cx6="http://schemas.microsoft.com/office/drawing/2016/5/12/chartex" xmlns:cx7="http://schemas.microsoft.com/office/drawing/2016/5/13/chartex" xmlns:cx8="http://schemas.microsoft.com/office/drawing/2016/5/14/chartex" xmlns:mc="http://schemas.openxmlformats.org/markup-compatibility/2006" xmlns:aink="http://schemas.microsoft.com/office/drawing/2016/ink" xmlns:am3d="http://schemas.microsoft.com/office/drawing/2017/model3d" xmlns:o="urn:schemas-microsoft-com:office:office" xmlns:oel="http://schemas.microsoft.com/office/2019/extlst" xmlns:r="http://schemas.openxmlformats.org/officeDocument/2006/relationships" xmlns:m="http://schemas.openxmlformats.org/officeDocument/2006/math" xmlns:v="urn:schemas-microsoft-com:vml" xmlns:wp14="http://schemas.microsoft.com/office/word/2010/wordprocessingDrawing" xmlns:wp="http://schemas.openxmlformats.org/drawingml/2006/wordprocessingDrawing" xmlns:w10="urn:schemas-microsoft-com:office:word" xmlns:w="http://schemas.openxmlformats.org/wordprocessingml/2006/main" xmlns:w14="http://schemas.microsoft.com/office/word/2010/wordml" xmlns:w15="http://schemas.microsoft.com/office/word/2012/wordml" xmlns:w16cex="http://schemas.microsoft.com/office/word/2018/wordml/cex" xmlns:w16cid="http://schemas.microsoft.com/office/word/2016/wordml/cid" xmlns:w16="http://schemas.microsoft.com/office/word/2018/wordml" xmlns:w16du="http://schemas.microsoft.com/office/word/2023/wordml/word16du" xmlns:w16sdtdh="http://schemas.microsoft.com/office/word/2020/wordml/sdtdatahash" xmlns:w16sdtfl="http://schemas.microsoft.com/office/word/2024/wordml/sdtformatlock" xmlns:w16se="http://schemas.microsoft.com/office/word/2015/wordml/symex" xmlns:wpg="http://schemas.microsoft.com/office/word/2010/wordprocessingGroup" xmlns:wpi="http://schemas.microsoft.com/office/word/2010/wordprocessingInk" xmlns:wne="http://schemas.microsoft.com/office/word/2006/wordml" xmlns:wps="http://schemas.microsoft.com/office/word/2010/wordprocessingShape" mc:Ignorable="w14 w15 w16se w16cid w16 w16cex w16sdtdh w16sdtfl w16du wp14">
   <w:p>
     <w:pPr>
-      <w:pStyle w:val="Nagwek"/>
+      <w:pStyle w:val="Header"/>
     </w:pPr>
   </w:p>
 </w:hdr>
@@ -6257,7 +5656,7 @@
 <w:hdr xmlns:wpc="http://schemas.microsoft.com/office/word/2010/wordprocessingCanvas" xmlns:cx="http://schemas.microsoft.com/office/drawing/2014/chartex" xmlns:cx1="http://schemas.microsoft.com/office/drawing/2015/9/8/chartex" xmlns:cx2="http://schemas.microsoft.com/office/drawing/2015/10/21/chartex" xmlns:cx3="http://schemas.microsoft.com/office/drawing/2016/5/9/chartex" xmlns:cx4="http://schemas.microsoft.com/office/drawing/2016/5/10/chartex" xmlns:cx5="http://schemas.microsoft.com/office/drawing/2016/5/11/chartex" xmlns:cx6="http://schemas.microsoft.com/office/drawing/2016/5/12/chartex" xmlns:cx7="http://schemas.microsoft.com/office/drawing/2016/5/13/chartex" xmlns:cx8="http://schemas.microsoft.com/office/drawing/2016/5/14/chartex" xmlns:mc="http://schemas.openxmlformats.org/markup-compatibility/2006" xmlns:aink="http://schemas.microsoft.com/office/drawing/2016/ink" xmlns:am3d="http://schemas.microsoft.com/office/drawing/2017/model3d" xmlns:o="urn:schemas-microsoft-com:office:office" xmlns:oel="http://schemas.microsoft.com/office/2019/extlst" xmlns:r="http://schemas.openxmlformats.org/officeDocument/2006/relationships" xmlns:m="http://schemas.openxmlformats.org/officeDocument/2006/math" xmlns:v="urn:schemas-microsoft-com:vml" xmlns:wp14="http://schemas.microsoft.com/office/word/2010/wordprocessingDrawing" xmlns:wp="http://schemas.openxmlformats.org/drawingml/2006/wordprocessingDrawing" xmlns:w10="urn:schemas-microsoft-com:office:word" xmlns:w="http://schemas.openxmlformats.org/wordprocessingml/2006/main" xmlns:w14="http://schemas.microsoft.com/office/word/2010/wordml" xmlns:w15="http://schemas.microsoft.com/office/word/2012/wordml" xmlns:w16cex="http://schemas.microsoft.com/office/word/2018/wordml/cex" xmlns:w16cid="http://schemas.microsoft.com/office/word/2016/wordml/cid" xmlns:w16="http://schemas.microsoft.com/office/word/2018/wordml" xmlns:w16du="http://schemas.microsoft.com/office/word/2023/wordml/word16du" xmlns:w16sdtdh="http://schemas.microsoft.com/office/word/2020/wordml/sdtdatahash" xmlns:w16sdtfl="http://schemas.microsoft.com/office/word/2024/wordml/sdtformatlock" xmlns:w16se="http://schemas.microsoft.com/office/word/2015/wordml/symex" xmlns:wpg="http://schemas.microsoft.com/office/word/2010/wordprocessingGroup" xmlns:wpi="http://schemas.microsoft.com/office/word/2010/wordprocessingInk" xmlns:wne="http://schemas.microsoft.com/office/word/2006/wordml" xmlns:wps="http://schemas.microsoft.com/office/word/2010/wordprocessingShape" mc:Ignorable="w14 w15 w16se w16cid w16 w16cex w16sdtdh w16sdtfl w16du wp14">
   <w:p>
     <w:pPr>
-      <w:pStyle w:val="Nagwek"/>
+      <w:pStyle w:val="Header"/>
       <w:tabs>
         <w:tab w:val="clear" w:pos="9072"/>
       </w:tabs>
@@ -6330,7 +5729,7 @@
 <w:hdr xmlns:wpc="http://schemas.microsoft.com/office/word/2010/wordprocessingCanvas" xmlns:cx="http://schemas.microsoft.com/office/drawing/2014/chartex" xmlns:cx1="http://schemas.microsoft.com/office/drawing/2015/9/8/chartex" xmlns:cx2="http://schemas.microsoft.com/office/drawing/2015/10/21/chartex" xmlns:cx3="http://schemas.microsoft.com/office/drawing/2016/5/9/chartex" xmlns:cx4="http://schemas.microsoft.com/office/drawing/2016/5/10/chartex" xmlns:cx5="http://schemas.microsoft.com/office/drawing/2016/5/11/chartex" xmlns:cx6="http://schemas.microsoft.com/office/drawing/2016/5/12/chartex" xmlns:cx7="http://schemas.microsoft.com/office/drawing/2016/5/13/chartex" xmlns:cx8="http://schemas.microsoft.com/office/drawing/2016/5/14/chartex" xmlns:mc="http://schemas.openxmlformats.org/markup-compatibility/2006" xmlns:aink="http://schemas.microsoft.com/office/drawing/2016/ink" xmlns:am3d="http://schemas.microsoft.com/office/drawing/2017/model3d" xmlns:o="urn:schemas-microsoft-com:office:office" xmlns:oel="http://schemas.microsoft.com/office/2019/extlst" xmlns:r="http://schemas.openxmlformats.org/officeDocument/2006/relationships" xmlns:m="http://schemas.openxmlformats.org/officeDocument/2006/math" xmlns:v="urn:schemas-microsoft-com:vml" xmlns:wp14="http://schemas.microsoft.com/office/word/2010/wordprocessingDrawing" xmlns:wp="http://schemas.openxmlformats.org/drawingml/2006/wordprocessingDrawing" xmlns:w10="urn:schemas-microsoft-com:office:word" xmlns:w="http://schemas.openxmlformats.org/wordprocessingml/2006/main" xmlns:w14="http://schemas.microsoft.com/office/word/2010/wordml" xmlns:w15="http://schemas.microsoft.com/office/word/2012/wordml" xmlns:w16cex="http://schemas.microsoft.com/office/word/2018/wordml/cex" xmlns:w16cid="http://schemas.microsoft.com/office/word/2016/wordml/cid" xmlns:w16="http://schemas.microsoft.com/office/word/2018/wordml" xmlns:w16du="http://schemas.microsoft.com/office/word/2023/wordml/word16du" xmlns:w16sdtdh="http://schemas.microsoft.com/office/word/2020/wordml/sdtdatahash" xmlns:w16sdtfl="http://schemas.microsoft.com/office/word/2024/wordml/sdtformatlock" xmlns:w16se="http://schemas.microsoft.com/office/word/2015/wordml/symex" xmlns:wpg="http://schemas.microsoft.com/office/word/2010/wordprocessingGroup" xmlns:wpi="http://schemas.microsoft.com/office/word/2010/wordprocessingInk" xmlns:wne="http://schemas.microsoft.com/office/word/2006/wordml" xmlns:wps="http://schemas.microsoft.com/office/word/2010/wordprocessingShape" mc:Ignorable="w14 w15 w16se w16cid w16 w16cex w16sdtdh w16sdtfl w16du wp14">
   <w:p>
     <w:pPr>
-      <w:pStyle w:val="Nagwek"/>
+      <w:pStyle w:val="Header"/>
     </w:pPr>
     <w:r>
       <w:rPr>
@@ -11141,7 +10540,7 @@
     <w:lsdException w:name="Unresolved Mention" w:semiHidden="1" w:unhideWhenUsed="1"/>
     <w:lsdException w:name="Smart Link" w:semiHidden="1" w:unhideWhenUsed="1"/>
   </w:latentStyles>
-  <w:style w:type="paragraph" w:default="1" w:styleId="Normalny">
+  <w:style w:type="paragraph" w:default="1" w:styleId="Normal">
     <w:name w:val="Normal"/>
     <w:qFormat/>
     <w:rsid w:val="00CD1ADE"/>
@@ -11155,11 +10554,11 @@
       <w14:ligatures w14:val="none"/>
     </w:rPr>
   </w:style>
-  <w:style w:type="paragraph" w:styleId="Nagwek1">
+  <w:style w:type="paragraph" w:styleId="Heading1">
     <w:name w:val="heading 1"/>
-    <w:basedOn w:val="Normalny"/>
-    <w:next w:val="Normalny"/>
-    <w:link w:val="Nagwek1Znak"/>
+    <w:basedOn w:val="Normal"/>
+    <w:next w:val="Normal"/>
+    <w:link w:val="Heading1Char"/>
     <w:uiPriority w:val="9"/>
     <w:qFormat/>
     <w:rsid w:val="005E0DE7"/>
@@ -11177,11 +10576,11 @@
       <w:szCs w:val="40"/>
     </w:rPr>
   </w:style>
-  <w:style w:type="paragraph" w:styleId="Nagwek2">
+  <w:style w:type="paragraph" w:styleId="Heading2">
     <w:name w:val="heading 2"/>
-    <w:basedOn w:val="Normalny"/>
-    <w:next w:val="Normalny"/>
-    <w:link w:val="Nagwek2Znak"/>
+    <w:basedOn w:val="Normal"/>
+    <w:next w:val="Normal"/>
+    <w:link w:val="Heading2Char"/>
     <w:uiPriority w:val="9"/>
     <w:unhideWhenUsed/>
     <w:qFormat/>
@@ -11200,11 +10599,11 @@
       <w:szCs w:val="32"/>
     </w:rPr>
   </w:style>
-  <w:style w:type="paragraph" w:styleId="Nagwek3">
+  <w:style w:type="paragraph" w:styleId="Heading3">
     <w:name w:val="heading 3"/>
-    <w:basedOn w:val="Normalny"/>
-    <w:next w:val="Normalny"/>
-    <w:link w:val="Nagwek3Znak"/>
+    <w:basedOn w:val="Normal"/>
+    <w:next w:val="Normal"/>
+    <w:link w:val="Heading3Char"/>
     <w:uiPriority w:val="9"/>
     <w:unhideWhenUsed/>
     <w:qFormat/>
@@ -11223,11 +10622,11 @@
       <w:szCs w:val="28"/>
     </w:rPr>
   </w:style>
-  <w:style w:type="paragraph" w:styleId="Nagwek4">
+  <w:style w:type="paragraph" w:styleId="Heading4">
     <w:name w:val="heading 4"/>
-    <w:basedOn w:val="Normalny"/>
-    <w:next w:val="Normalny"/>
-    <w:link w:val="Nagwek4Znak"/>
+    <w:basedOn w:val="Normal"/>
+    <w:next w:val="Normal"/>
+    <w:link w:val="Heading4Char"/>
     <w:uiPriority w:val="9"/>
     <w:semiHidden/>
     <w:unhideWhenUsed/>
@@ -11246,11 +10645,11 @@
       <w:color w:val="0F4761" w:themeColor="accent1" w:themeShade="BF"/>
     </w:rPr>
   </w:style>
-  <w:style w:type="paragraph" w:styleId="Nagwek5">
+  <w:style w:type="paragraph" w:styleId="Heading5">
     <w:name w:val="heading 5"/>
-    <w:basedOn w:val="Normalny"/>
-    <w:next w:val="Normalny"/>
-    <w:link w:val="Nagwek5Znak"/>
+    <w:basedOn w:val="Normal"/>
+    <w:next w:val="Normal"/>
+    <w:link w:val="Heading5Char"/>
     <w:uiPriority w:val="9"/>
     <w:semiHidden/>
     <w:unhideWhenUsed/>
@@ -11267,11 +10666,11 @@
       <w:color w:val="0F4761" w:themeColor="accent1" w:themeShade="BF"/>
     </w:rPr>
   </w:style>
-  <w:style w:type="paragraph" w:styleId="Nagwek6">
+  <w:style w:type="paragraph" w:styleId="Heading6">
     <w:name w:val="heading 6"/>
-    <w:basedOn w:val="Normalny"/>
-    <w:next w:val="Normalny"/>
-    <w:link w:val="Nagwek6Znak"/>
+    <w:basedOn w:val="Normal"/>
+    <w:next w:val="Normal"/>
+    <w:link w:val="Heading6Char"/>
     <w:uiPriority w:val="9"/>
     <w:semiHidden/>
     <w:unhideWhenUsed/>
@@ -11290,11 +10689,11 @@
       <w:color w:val="595959" w:themeColor="text1" w:themeTint="A6"/>
     </w:rPr>
   </w:style>
-  <w:style w:type="paragraph" w:styleId="Nagwek7">
+  <w:style w:type="paragraph" w:styleId="Heading7">
     <w:name w:val="heading 7"/>
-    <w:basedOn w:val="Normalny"/>
-    <w:next w:val="Normalny"/>
-    <w:link w:val="Nagwek7Znak"/>
+    <w:basedOn w:val="Normal"/>
+    <w:next w:val="Normal"/>
+    <w:link w:val="Heading7Char"/>
     <w:uiPriority w:val="9"/>
     <w:semiHidden/>
     <w:unhideWhenUsed/>
@@ -11311,11 +10710,11 @@
       <w:color w:val="595959" w:themeColor="text1" w:themeTint="A6"/>
     </w:rPr>
   </w:style>
-  <w:style w:type="paragraph" w:styleId="Nagwek8">
+  <w:style w:type="paragraph" w:styleId="Heading8">
     <w:name w:val="heading 8"/>
-    <w:basedOn w:val="Normalny"/>
-    <w:next w:val="Normalny"/>
-    <w:link w:val="Nagwek8Znak"/>
+    <w:basedOn w:val="Normal"/>
+    <w:next w:val="Normal"/>
+    <w:link w:val="Heading8Char"/>
     <w:uiPriority w:val="9"/>
     <w:semiHidden/>
     <w:unhideWhenUsed/>
@@ -11333,11 +10732,11 @@
       <w:color w:val="272727" w:themeColor="text1" w:themeTint="D8"/>
     </w:rPr>
   </w:style>
-  <w:style w:type="paragraph" w:styleId="Nagwek9">
+  <w:style w:type="paragraph" w:styleId="Heading9">
     <w:name w:val="heading 9"/>
-    <w:basedOn w:val="Normalny"/>
-    <w:next w:val="Normalny"/>
-    <w:link w:val="Nagwek9Znak"/>
+    <w:basedOn w:val="Normal"/>
+    <w:next w:val="Normal"/>
+    <w:link w:val="Heading9Char"/>
     <w:uiPriority w:val="9"/>
     <w:semiHidden/>
     <w:unhideWhenUsed/>
@@ -11353,12 +10752,13 @@
       <w:color w:val="272727" w:themeColor="text1" w:themeTint="D8"/>
     </w:rPr>
   </w:style>
-  <w:style w:type="character" w:default="1" w:styleId="Domylnaczcionkaakapitu">
+  <w:style w:type="character" w:default="1" w:styleId="DefaultParagraphFont">
     <w:name w:val="Default Paragraph Font"/>
     <w:uiPriority w:val="1"/>
+    <w:semiHidden/>
     <w:unhideWhenUsed/>
   </w:style>
-  <w:style w:type="table" w:default="1" w:styleId="Standardowy">
+  <w:style w:type="table" w:default="1" w:styleId="TableNormal">
     <w:name w:val="Normal Table"/>
     <w:uiPriority w:val="99"/>
     <w:semiHidden/>
@@ -11373,16 +10773,16 @@
       </w:tblCellMar>
     </w:tblPr>
   </w:style>
-  <w:style w:type="numbering" w:default="1" w:styleId="Bezlisty">
+  <w:style w:type="numbering" w:default="1" w:styleId="NoList">
     <w:name w:val="No List"/>
     <w:uiPriority w:val="99"/>
     <w:semiHidden/>
     <w:unhideWhenUsed/>
   </w:style>
-  <w:style w:type="character" w:customStyle="1" w:styleId="Nagwek1Znak">
-    <w:name w:val="Nagłówek 1 Znak"/>
-    <w:basedOn w:val="Domylnaczcionkaakapitu"/>
-    <w:link w:val="Nagwek1"/>
+  <w:style w:type="character" w:customStyle="1" w:styleId="Heading1Char">
+    <w:name w:val="Heading 1 Char"/>
+    <w:basedOn w:val="DefaultParagraphFont"/>
+    <w:link w:val="Heading1"/>
     <w:uiPriority w:val="9"/>
     <w:rsid w:val="005E0DE7"/>
     <w:rPr>
@@ -11396,10 +10796,10 @@
       <w14:ligatures w14:val="none"/>
     </w:rPr>
   </w:style>
-  <w:style w:type="character" w:customStyle="1" w:styleId="Nagwek2Znak">
-    <w:name w:val="Nagłówek 2 Znak"/>
-    <w:basedOn w:val="Domylnaczcionkaakapitu"/>
-    <w:link w:val="Nagwek2"/>
+  <w:style w:type="character" w:customStyle="1" w:styleId="Heading2Char">
+    <w:name w:val="Heading 2 Char"/>
+    <w:basedOn w:val="DefaultParagraphFont"/>
+    <w:link w:val="Heading2"/>
     <w:uiPriority w:val="9"/>
     <w:rsid w:val="005E0DE7"/>
     <w:rPr>
@@ -11413,10 +10813,10 @@
       <w14:ligatures w14:val="none"/>
     </w:rPr>
   </w:style>
-  <w:style w:type="character" w:customStyle="1" w:styleId="Nagwek3Znak">
-    <w:name w:val="Nagłówek 3 Znak"/>
-    <w:basedOn w:val="Domylnaczcionkaakapitu"/>
-    <w:link w:val="Nagwek3"/>
+  <w:style w:type="character" w:customStyle="1" w:styleId="Heading3Char">
+    <w:name w:val="Heading 3 Char"/>
+    <w:basedOn w:val="DefaultParagraphFont"/>
+    <w:link w:val="Heading3"/>
     <w:uiPriority w:val="9"/>
     <w:rsid w:val="005E0DE7"/>
     <w:rPr>
@@ -11430,10 +10830,10 @@
       <w14:ligatures w14:val="none"/>
     </w:rPr>
   </w:style>
-  <w:style w:type="character" w:customStyle="1" w:styleId="Nagwek4Znak">
-    <w:name w:val="Nagłówek 4 Znak"/>
-    <w:basedOn w:val="Domylnaczcionkaakapitu"/>
-    <w:link w:val="Nagwek4"/>
+  <w:style w:type="character" w:customStyle="1" w:styleId="Heading4Char">
+    <w:name w:val="Heading 4 Char"/>
+    <w:basedOn w:val="DefaultParagraphFont"/>
+    <w:link w:val="Heading4"/>
     <w:uiPriority w:val="9"/>
     <w:semiHidden/>
     <w:rsid w:val="00640543"/>
@@ -11444,10 +10844,10 @@
       <w:color w:val="0F4761" w:themeColor="accent1" w:themeShade="BF"/>
     </w:rPr>
   </w:style>
-  <w:style w:type="character" w:customStyle="1" w:styleId="Nagwek5Znak">
-    <w:name w:val="Nagłówek 5 Znak"/>
-    <w:basedOn w:val="Domylnaczcionkaakapitu"/>
-    <w:link w:val="Nagwek5"/>
+  <w:style w:type="character" w:customStyle="1" w:styleId="Heading5Char">
+    <w:name w:val="Heading 5 Char"/>
+    <w:basedOn w:val="DefaultParagraphFont"/>
+    <w:link w:val="Heading5"/>
     <w:uiPriority w:val="9"/>
     <w:semiHidden/>
     <w:rsid w:val="00640543"/>
@@ -11456,10 +10856,10 @@
       <w:color w:val="0F4761" w:themeColor="accent1" w:themeShade="BF"/>
     </w:rPr>
   </w:style>
-  <w:style w:type="character" w:customStyle="1" w:styleId="Nagwek6Znak">
-    <w:name w:val="Nagłówek 6 Znak"/>
-    <w:basedOn w:val="Domylnaczcionkaakapitu"/>
-    <w:link w:val="Nagwek6"/>
+  <w:style w:type="character" w:customStyle="1" w:styleId="Heading6Char">
+    <w:name w:val="Heading 6 Char"/>
+    <w:basedOn w:val="DefaultParagraphFont"/>
+    <w:link w:val="Heading6"/>
     <w:uiPriority w:val="9"/>
     <w:semiHidden/>
     <w:rsid w:val="00640543"/>
@@ -11470,10 +10870,10 @@
       <w:color w:val="595959" w:themeColor="text1" w:themeTint="A6"/>
     </w:rPr>
   </w:style>
-  <w:style w:type="character" w:customStyle="1" w:styleId="Nagwek7Znak">
-    <w:name w:val="Nagłówek 7 Znak"/>
-    <w:basedOn w:val="Domylnaczcionkaakapitu"/>
-    <w:link w:val="Nagwek7"/>
+  <w:style w:type="character" w:customStyle="1" w:styleId="Heading7Char">
+    <w:name w:val="Heading 7 Char"/>
+    <w:basedOn w:val="DefaultParagraphFont"/>
+    <w:link w:val="Heading7"/>
     <w:uiPriority w:val="9"/>
     <w:semiHidden/>
     <w:rsid w:val="00640543"/>
@@ -11482,10 +10882,10 @@
       <w:color w:val="595959" w:themeColor="text1" w:themeTint="A6"/>
     </w:rPr>
   </w:style>
-  <w:style w:type="character" w:customStyle="1" w:styleId="Nagwek8Znak">
-    <w:name w:val="Nagłówek 8 Znak"/>
-    <w:basedOn w:val="Domylnaczcionkaakapitu"/>
-    <w:link w:val="Nagwek8"/>
+  <w:style w:type="character" w:customStyle="1" w:styleId="Heading8Char">
+    <w:name w:val="Heading 8 Char"/>
+    <w:basedOn w:val="DefaultParagraphFont"/>
+    <w:link w:val="Heading8"/>
     <w:uiPriority w:val="9"/>
     <w:semiHidden/>
     <w:rsid w:val="00640543"/>
@@ -11496,10 +10896,10 @@
       <w:color w:val="272727" w:themeColor="text1" w:themeTint="D8"/>
     </w:rPr>
   </w:style>
-  <w:style w:type="character" w:customStyle="1" w:styleId="Nagwek9Znak">
-    <w:name w:val="Nagłówek 9 Znak"/>
-    <w:basedOn w:val="Domylnaczcionkaakapitu"/>
-    <w:link w:val="Nagwek9"/>
+  <w:style w:type="character" w:customStyle="1" w:styleId="Heading9Char">
+    <w:name w:val="Heading 9 Char"/>
+    <w:basedOn w:val="DefaultParagraphFont"/>
+    <w:link w:val="Heading9"/>
     <w:uiPriority w:val="9"/>
     <w:semiHidden/>
     <w:rsid w:val="00640543"/>
@@ -11508,11 +10908,11 @@
       <w:color w:val="272727" w:themeColor="text1" w:themeTint="D8"/>
     </w:rPr>
   </w:style>
-  <w:style w:type="paragraph" w:styleId="Tytu">
+  <w:style w:type="paragraph" w:styleId="Title">
     <w:name w:val="Title"/>
-    <w:basedOn w:val="Normalny"/>
-    <w:next w:val="Normalny"/>
-    <w:link w:val="TytuZnak"/>
+    <w:basedOn w:val="Normal"/>
+    <w:next w:val="Normal"/>
+    <w:link w:val="TitleChar"/>
     <w:uiPriority w:val="10"/>
     <w:qFormat/>
     <w:rsid w:val="00640543"/>
@@ -11528,10 +10928,10 @@
       <w:szCs w:val="56"/>
     </w:rPr>
   </w:style>
-  <w:style w:type="character" w:customStyle="1" w:styleId="TytuZnak">
-    <w:name w:val="Tytuł Znak"/>
-    <w:basedOn w:val="Domylnaczcionkaakapitu"/>
-    <w:link w:val="Tytu"/>
+  <w:style w:type="character" w:customStyle="1" w:styleId="TitleChar">
+    <w:name w:val="Title Char"/>
+    <w:basedOn w:val="DefaultParagraphFont"/>
+    <w:link w:val="Title"/>
     <w:uiPriority w:val="10"/>
     <w:rsid w:val="00640543"/>
     <w:rPr>
@@ -11542,11 +10942,11 @@
       <w:szCs w:val="56"/>
     </w:rPr>
   </w:style>
-  <w:style w:type="paragraph" w:styleId="Podtytu">
+  <w:style w:type="paragraph" w:styleId="Subtitle">
     <w:name w:val="Subtitle"/>
-    <w:basedOn w:val="Normalny"/>
-    <w:next w:val="Normalny"/>
-    <w:link w:val="PodtytuZnak"/>
+    <w:basedOn w:val="Normal"/>
+    <w:next w:val="Normal"/>
+    <w:link w:val="SubtitleChar"/>
     <w:uiPriority w:val="11"/>
     <w:qFormat/>
     <w:rsid w:val="00640543"/>
@@ -11563,10 +10963,10 @@
       <w:szCs w:val="28"/>
     </w:rPr>
   </w:style>
-  <w:style w:type="character" w:customStyle="1" w:styleId="PodtytuZnak">
-    <w:name w:val="Podtytuł Znak"/>
-    <w:basedOn w:val="Domylnaczcionkaakapitu"/>
-    <w:link w:val="Podtytu"/>
+  <w:style w:type="character" w:customStyle="1" w:styleId="SubtitleChar">
+    <w:name w:val="Subtitle Char"/>
+    <w:basedOn w:val="DefaultParagraphFont"/>
+    <w:link w:val="Subtitle"/>
     <w:uiPriority w:val="11"/>
     <w:rsid w:val="00640543"/>
     <w:rPr>
@@ -11577,11 +10977,11 @@
       <w:szCs w:val="28"/>
     </w:rPr>
   </w:style>
-  <w:style w:type="paragraph" w:styleId="Cytat">
+  <w:style w:type="paragraph" w:styleId="Quote">
     <w:name w:val="Quote"/>
-    <w:basedOn w:val="Normalny"/>
-    <w:next w:val="Normalny"/>
-    <w:link w:val="CytatZnak"/>
+    <w:basedOn w:val="Normal"/>
+    <w:next w:val="Normal"/>
+    <w:link w:val="QuoteChar"/>
     <w:uiPriority w:val="29"/>
     <w:qFormat/>
     <w:rsid w:val="00640543"/>
@@ -11595,10 +10995,10 @@
       <w:color w:val="404040" w:themeColor="text1" w:themeTint="BF"/>
     </w:rPr>
   </w:style>
-  <w:style w:type="character" w:customStyle="1" w:styleId="CytatZnak">
-    <w:name w:val="Cytat Znak"/>
-    <w:basedOn w:val="Domylnaczcionkaakapitu"/>
-    <w:link w:val="Cytat"/>
+  <w:style w:type="character" w:customStyle="1" w:styleId="QuoteChar">
+    <w:name w:val="Quote Char"/>
+    <w:basedOn w:val="DefaultParagraphFont"/>
+    <w:link w:val="Quote"/>
     <w:uiPriority w:val="29"/>
     <w:rsid w:val="00640543"/>
     <w:rPr>
@@ -11607,9 +11007,9 @@
       <w:color w:val="404040" w:themeColor="text1" w:themeTint="BF"/>
     </w:rPr>
   </w:style>
-  <w:style w:type="paragraph" w:styleId="Akapitzlist">
+  <w:style w:type="paragraph" w:styleId="ListParagraph">
     <w:name w:val="List Paragraph"/>
-    <w:basedOn w:val="Normalny"/>
+    <w:basedOn w:val="Normal"/>
     <w:uiPriority w:val="34"/>
     <w:qFormat/>
     <w:rsid w:val="00640543"/>
@@ -11618,9 +11018,9 @@
       <w:contextualSpacing/>
     </w:pPr>
   </w:style>
-  <w:style w:type="character" w:styleId="Wyrnienieintensywne">
+  <w:style w:type="character" w:styleId="IntenseEmphasis">
     <w:name w:val="Intense Emphasis"/>
-    <w:basedOn w:val="Domylnaczcionkaakapitu"/>
+    <w:basedOn w:val="DefaultParagraphFont"/>
     <w:uiPriority w:val="21"/>
     <w:qFormat/>
     <w:rsid w:val="00640543"/>
@@ -11630,11 +11030,11 @@
       <w:color w:val="0F4761" w:themeColor="accent1" w:themeShade="BF"/>
     </w:rPr>
   </w:style>
-  <w:style w:type="paragraph" w:styleId="Cytatintensywny">
+  <w:style w:type="paragraph" w:styleId="IntenseQuote">
     <w:name w:val="Intense Quote"/>
-    <w:basedOn w:val="Normalny"/>
-    <w:next w:val="Normalny"/>
-    <w:link w:val="CytatintensywnyZnak"/>
+    <w:basedOn w:val="Normal"/>
+    <w:next w:val="Normal"/>
+    <w:link w:val="IntenseQuoteChar"/>
     <w:uiPriority w:val="30"/>
     <w:qFormat/>
     <w:rsid w:val="00640543"/>
@@ -11653,10 +11053,10 @@
       <w:color w:val="0F4761" w:themeColor="accent1" w:themeShade="BF"/>
     </w:rPr>
   </w:style>
-  <w:style w:type="character" w:customStyle="1" w:styleId="CytatintensywnyZnak">
-    <w:name w:val="Cytat intensywny Znak"/>
-    <w:basedOn w:val="Domylnaczcionkaakapitu"/>
-    <w:link w:val="Cytatintensywny"/>
+  <w:style w:type="character" w:customStyle="1" w:styleId="IntenseQuoteChar">
+    <w:name w:val="Intense Quote Char"/>
+    <w:basedOn w:val="DefaultParagraphFont"/>
+    <w:link w:val="IntenseQuote"/>
     <w:uiPriority w:val="30"/>
     <w:rsid w:val="00640543"/>
     <w:rPr>
@@ -11665,9 +11065,9 @@
       <w:color w:val="0F4761" w:themeColor="accent1" w:themeShade="BF"/>
     </w:rPr>
   </w:style>
-  <w:style w:type="character" w:styleId="Odwoanieintensywne">
+  <w:style w:type="character" w:styleId="IntenseReference">
     <w:name w:val="Intense Reference"/>
-    <w:basedOn w:val="Domylnaczcionkaakapitu"/>
+    <w:basedOn w:val="DefaultParagraphFont"/>
     <w:uiPriority w:val="32"/>
     <w:qFormat/>
     <w:rsid w:val="00640543"/>
@@ -11679,10 +11079,10 @@
       <w:spacing w:val="5"/>
     </w:rPr>
   </w:style>
-  <w:style w:type="paragraph" w:styleId="Nagwek">
+  <w:style w:type="paragraph" w:styleId="Header">
     <w:name w:val="header"/>
-    <w:basedOn w:val="Normalny"/>
-    <w:link w:val="NagwekZnak"/>
+    <w:basedOn w:val="Normal"/>
+    <w:link w:val="HeaderChar"/>
     <w:rsid w:val="007621B7"/>
     <w:pPr>
       <w:tabs>
@@ -11691,10 +11091,10 @@
       </w:tabs>
     </w:pPr>
   </w:style>
-  <w:style w:type="character" w:customStyle="1" w:styleId="NagwekZnak">
-    <w:name w:val="Nagłówek Znak"/>
-    <w:basedOn w:val="Domylnaczcionkaakapitu"/>
-    <w:link w:val="Nagwek"/>
+  <w:style w:type="character" w:customStyle="1" w:styleId="HeaderChar">
+    <w:name w:val="Header Char"/>
+    <w:basedOn w:val="DefaultParagraphFont"/>
+    <w:link w:val="Header"/>
     <w:rsid w:val="007621B7"/>
     <w:rPr>
       <w:rFonts w:ascii="Times New Roman" w:eastAsia="Times New Roman" w:hAnsi="Times New Roman" w:cs="Times New Roman"/>
@@ -11703,10 +11103,10 @@
       <w14:ligatures w14:val="none"/>
     </w:rPr>
   </w:style>
-  <w:style w:type="paragraph" w:styleId="Stopka">
+  <w:style w:type="paragraph" w:styleId="Footer">
     <w:name w:val="footer"/>
-    <w:basedOn w:val="Normalny"/>
-    <w:link w:val="StopkaZnak"/>
+    <w:basedOn w:val="Normal"/>
+    <w:link w:val="FooterChar"/>
     <w:rsid w:val="007621B7"/>
     <w:pPr>
       <w:tabs>
@@ -11718,10 +11118,10 @@
       <w:lang w:val="x-none" w:eastAsia="x-none"/>
     </w:rPr>
   </w:style>
-  <w:style w:type="character" w:customStyle="1" w:styleId="StopkaZnak">
-    <w:name w:val="Stopka Znak"/>
-    <w:basedOn w:val="Domylnaczcionkaakapitu"/>
-    <w:link w:val="Stopka"/>
+  <w:style w:type="character" w:customStyle="1" w:styleId="FooterChar">
+    <w:name w:val="Footer Char"/>
+    <w:basedOn w:val="DefaultParagraphFont"/>
+    <w:link w:val="Footer"/>
     <w:rsid w:val="007621B7"/>
     <w:rPr>
       <w:rFonts w:ascii="Times New Roman" w:eastAsia="Times New Roman" w:hAnsi="Times New Roman" w:cs="Times New Roman"/>
@@ -11730,14 +11130,14 @@
       <w14:ligatures w14:val="none"/>
     </w:rPr>
   </w:style>
-  <w:style w:type="character" w:styleId="Numerstrony">
+  <w:style w:type="character" w:styleId="PageNumber">
     <w:name w:val="page number"/>
     <w:rsid w:val="007621B7"/>
   </w:style>
-  <w:style w:type="paragraph" w:styleId="Nagwekspisutreci">
+  <w:style w:type="paragraph" w:styleId="TOCHeading">
     <w:name w:val="TOC Heading"/>
-    <w:basedOn w:val="Nagwek1"/>
-    <w:next w:val="Normalny"/>
+    <w:basedOn w:val="Heading1"/>
+    <w:next w:val="Normal"/>
     <w:uiPriority w:val="39"/>
     <w:unhideWhenUsed/>
     <w:qFormat/>
@@ -11750,10 +11150,10 @@
       <w:szCs w:val="32"/>
     </w:rPr>
   </w:style>
-  <w:style w:type="paragraph" w:styleId="Spistreci1">
+  <w:style w:type="paragraph" w:styleId="TOC1">
     <w:name w:val="toc 1"/>
-    <w:basedOn w:val="Normalny"/>
-    <w:next w:val="Normalny"/>
+    <w:basedOn w:val="Normal"/>
+    <w:next w:val="Normal"/>
     <w:autoRedefine/>
     <w:uiPriority w:val="39"/>
     <w:unhideWhenUsed/>
@@ -11762,10 +11162,10 @@
       <w:spacing w:after="100"/>
     </w:pPr>
   </w:style>
-  <w:style w:type="paragraph" w:styleId="Spistreci2">
+  <w:style w:type="paragraph" w:styleId="TOC2">
     <w:name w:val="toc 2"/>
-    <w:basedOn w:val="Normalny"/>
-    <w:next w:val="Normalny"/>
+    <w:basedOn w:val="Normal"/>
+    <w:next w:val="Normal"/>
     <w:autoRedefine/>
     <w:uiPriority w:val="39"/>
     <w:unhideWhenUsed/>
@@ -11775,10 +11175,10 @@
       <w:ind w:left="240"/>
     </w:pPr>
   </w:style>
-  <w:style w:type="paragraph" w:styleId="Spistreci3">
+  <w:style w:type="paragraph" w:styleId="TOC3">
     <w:name w:val="toc 3"/>
-    <w:basedOn w:val="Normalny"/>
-    <w:next w:val="Normalny"/>
+    <w:basedOn w:val="Normal"/>
+    <w:next w:val="Normal"/>
     <w:autoRedefine/>
     <w:uiPriority w:val="39"/>
     <w:unhideWhenUsed/>
@@ -11788,9 +11188,9 @@
       <w:ind w:left="480"/>
     </w:pPr>
   </w:style>
-  <w:style w:type="character" w:styleId="Hipercze">
+  <w:style w:type="character" w:styleId="Hyperlink">
     <w:name w:val="Hyperlink"/>
-    <w:basedOn w:val="Domylnaczcionkaakapitu"/>
+    <w:basedOn w:val="DefaultParagraphFont"/>
     <w:uiPriority w:val="99"/>
     <w:unhideWhenUsed/>
     <w:rsid w:val="005E0DE7"/>
@@ -11799,10 +11199,10 @@
       <w:u w:val="single"/>
     </w:rPr>
   </w:style>
-  <w:style w:type="paragraph" w:styleId="Tekstprzypisukocowego">
+  <w:style w:type="paragraph" w:styleId="EndnoteText">
     <w:name w:val="endnote text"/>
-    <w:basedOn w:val="Normalny"/>
-    <w:link w:val="TekstprzypisukocowegoZnak"/>
+    <w:basedOn w:val="Normal"/>
+    <w:link w:val="EndnoteTextChar"/>
     <w:uiPriority w:val="99"/>
     <w:semiHidden/>
     <w:unhideWhenUsed/>
@@ -11812,10 +11212,10 @@
       <w:szCs w:val="20"/>
     </w:rPr>
   </w:style>
-  <w:style w:type="character" w:customStyle="1" w:styleId="TekstprzypisukocowegoZnak">
-    <w:name w:val="Tekst przypisu końcowego Znak"/>
-    <w:basedOn w:val="Domylnaczcionkaakapitu"/>
-    <w:link w:val="Tekstprzypisukocowego"/>
+  <w:style w:type="character" w:customStyle="1" w:styleId="EndnoteTextChar">
+    <w:name w:val="Endnote Text Char"/>
+    <w:basedOn w:val="DefaultParagraphFont"/>
+    <w:link w:val="EndnoteText"/>
     <w:uiPriority w:val="99"/>
     <w:semiHidden/>
     <w:rsid w:val="00A51C85"/>
@@ -11828,9 +11228,9 @@
       <w14:ligatures w14:val="none"/>
     </w:rPr>
   </w:style>
-  <w:style w:type="character" w:styleId="Odwoanieprzypisukocowego">
+  <w:style w:type="character" w:styleId="EndnoteReference">
     <w:name w:val="endnote reference"/>
-    <w:basedOn w:val="Domylnaczcionkaakapitu"/>
+    <w:basedOn w:val="DefaultParagraphFont"/>
     <w:uiPriority w:val="99"/>
     <w:semiHidden/>
     <w:unhideWhenUsed/>
@@ -11839,9 +11239,9 @@
       <w:vertAlign w:val="superscript"/>
     </w:rPr>
   </w:style>
-  <w:style w:type="character" w:styleId="Nierozpoznanawzmianka">
+  <w:style w:type="character" w:styleId="UnresolvedMention">
     <w:name w:val="Unresolved Mention"/>
-    <w:basedOn w:val="Domylnaczcionkaakapitu"/>
+    <w:basedOn w:val="DefaultParagraphFont"/>
     <w:uiPriority w:val="99"/>
     <w:semiHidden/>
     <w:unhideWhenUsed/>
@@ -12170,6 +11570,10 @@
 </file>
 
 <file path=customXml/item1.xml><?xml version="1.0" encoding="utf-8"?>
+<b:Sources xmlns:b="http://schemas.openxmlformats.org/officeDocument/2006/bibliography" xmlns="http://schemas.openxmlformats.org/officeDocument/2006/bibliography" SelectedStyle="\APASixthEditionOfficeOnline.xsl" StyleName="APA" Version="6"/>
+</file>
+
+<file path=customXml/item2.xml><?xml version="1.0" encoding="utf-8"?>
 <ct:contentTypeSchema xmlns:ct="http://schemas.microsoft.com/office/2006/metadata/contentType" xmlns:ma="http://schemas.microsoft.com/office/2006/metadata/properties/metaAttributes" ct:_="" ma:_="" ma:contentTypeName="Dokument" ma:contentTypeID="0x0101002A47B328A18E094B9EF53C22F068078F" ma:contentTypeVersion="3" ma:contentTypeDescription="Utwórz nowy dokument." ma:contentTypeScope="" ma:versionID="20eeeb653e62edb580814da916af8bb2">
   <xsd:schema xmlns:xsd="http://www.w3.org/2001/XMLSchema" xmlns:xs="http://www.w3.org/2001/XMLSchema" xmlns:p="http://schemas.microsoft.com/office/2006/metadata/properties" xmlns:ns2="326803d7-d8be-486d-a084-29441079d8b7" targetNamespace="http://schemas.microsoft.com/office/2006/metadata/properties" ma:root="true" ma:fieldsID="92719727ba4d1dd87ef0f6714045b47a" ns2:_="">
     <xsd:import namespace="326803d7-d8be-486d-a084-29441079d8b7"/>
@@ -12307,11 +11711,13 @@
 </ct:contentTypeSchema>
 </file>
 
-<file path=customXml/item2.xml><?xml version="1.0" encoding="utf-8"?>
-<b:Sources xmlns:b="http://schemas.openxmlformats.org/officeDocument/2006/bibliography" xmlns="http://schemas.openxmlformats.org/officeDocument/2006/bibliography" SelectedStyle="\APASixthEditionOfficeOnline.xsl" StyleName="APA" Version="6"/>
+<file path=customXml/item3.xml><?xml version="1.0" encoding="utf-8"?>
+<p:properties xmlns:p="http://schemas.microsoft.com/office/2006/metadata/properties" xmlns:xsi="http://www.w3.org/2001/XMLSchema-instance" xmlns:pc="http://schemas.microsoft.com/office/infopath/2007/PartnerControls">
+  <documentManagement/>
+</p:properties>
 </file>
 
-<file path=customXml/item3.xml><?xml version="1.0" encoding="utf-8"?>
+<file path=customXml/item4.xml><?xml version="1.0" encoding="utf-8"?>
 <?mso-contentType ?>
 <FormTemplates xmlns="http://schemas.microsoft.com/sharepoint/v3/contenttype/forms">
   <Display>DocumentLibraryForm</Display>
@@ -12320,13 +11726,15 @@
 </FormTemplates>
 </file>
 
-<file path=customXml/item4.xml><?xml version="1.0" encoding="utf-8"?>
-<p:properties xmlns:p="http://schemas.microsoft.com/office/2006/metadata/properties" xmlns:xsi="http://www.w3.org/2001/XMLSchema-instance" xmlns:pc="http://schemas.microsoft.com/office/infopath/2007/PartnerControls">
-  <documentManagement/>
-</p:properties>
+<file path=customXml/itemProps1.xml><?xml version="1.0" encoding="utf-8"?>
+<ds:datastoreItem xmlns:ds="http://schemas.openxmlformats.org/officeDocument/2006/customXml" ds:itemID="{06BF7A6E-5245-4FAA-8155-32709F41727B}">
+  <ds:schemaRefs>
+    <ds:schemaRef ds:uri="http://schemas.openxmlformats.org/officeDocument/2006/bibliography"/>
+  </ds:schemaRefs>
+</ds:datastoreItem>
 </file>
 
-<file path=customXml/itemProps1.xml><?xml version="1.0" encoding="utf-8"?>
+<file path=customXml/itemProps2.xml><?xml version="1.0" encoding="utf-8"?>
 <ds:datastoreItem xmlns:ds="http://schemas.openxmlformats.org/officeDocument/2006/customXml" ds:itemID="{6C62FD72-4AE9-48D1-9079-FE9F7C350712}">
   <ds:schemaRefs>
     <ds:schemaRef ds:uri="http://schemas.microsoft.com/office/2006/metadata/contentType"/>
@@ -12344,27 +11752,19 @@
 </ds:datastoreItem>
 </file>
 
-<file path=customXml/itemProps2.xml><?xml version="1.0" encoding="utf-8"?>
-<ds:datastoreItem xmlns:ds="http://schemas.openxmlformats.org/officeDocument/2006/customXml" ds:itemID="{06BF7A6E-5245-4FAA-8155-32709F41727B}">
-  <ds:schemaRefs>
-    <ds:schemaRef ds:uri="http://schemas.openxmlformats.org/officeDocument/2006/bibliography"/>
-  </ds:schemaRefs>
-</ds:datastoreItem>
-</file>
-
 <file path=customXml/itemProps3.xml><?xml version="1.0" encoding="utf-8"?>
-<ds:datastoreItem xmlns:ds="http://schemas.openxmlformats.org/officeDocument/2006/customXml" ds:itemID="{E98FCB9D-D551-4249-9F65-3A504ED32D36}">
-  <ds:schemaRefs>
-    <ds:schemaRef ds:uri="http://schemas.microsoft.com/sharepoint/v3/contenttype/forms"/>
-  </ds:schemaRefs>
-</ds:datastoreItem>
-</file>
-
-<file path=customXml/itemProps4.xml><?xml version="1.0" encoding="utf-8"?>
 <ds:datastoreItem xmlns:ds="http://schemas.openxmlformats.org/officeDocument/2006/customXml" ds:itemID="{D47433C4-7F90-48A4-AF53-D7EE7E4EDE32}">
   <ds:schemaRefs>
     <ds:schemaRef ds:uri="http://schemas.microsoft.com/office/2006/metadata/properties"/>
     <ds:schemaRef ds:uri="http://schemas.microsoft.com/office/infopath/2007/PartnerControls"/>
   </ds:schemaRefs>
 </ds:datastoreItem>
+</file>
+
+<file path=customXml/itemProps4.xml><?xml version="1.0" encoding="utf-8"?>
+<ds:datastoreItem xmlns:ds="http://schemas.openxmlformats.org/officeDocument/2006/customXml" ds:itemID="{E98FCB9D-D551-4249-9F65-3A504ED32D36}">
+  <ds:schemaRefs>
+    <ds:schemaRef ds:uri="http://schemas.microsoft.com/sharepoint/v3/contenttype/forms"/>
+  </ds:schemaRefs>
+</ds:datastoreItem>
 </file>
</xml_diff>